<commit_message>
Actualiza el ERS a la versión 1.1
Alinea el documento con el estado actual del sistema: Supabase local,
sesión con JWT en cookie httpOnly, separación por compañía, flujo de
fallas (reporte, derivación y mantención), preventiva cada 6 meses,
estado automático del vehículo y reportería por rango de fechas.
Agrega RF-37 a RF-49, RNF-11 a RNF-13, la tabla reporte_falla al
modelo de datos y corrige referencias, puertos y numeración.

Co-Authored-By: Claude Opus 5.5 <noreply@anthropic.com>
</commit_message>
<xml_diff>
--- a/Fase 2/Evidencias/docs/ERS_SIGMAVE.docx
+++ b/Fase 2/Evidencias/docs/ERS_SIGMAVE.docx
@@ -154,7 +154,7 @@
               <w:rPr>
                 <w:sz w:val="20"/>
               </w:rPr>
-              <w:t>Institución</w:t>
+              <w:t xml:space="preserve">Institución</w:t>
             </w:r>
           </w:p>
         </w:tc>
@@ -167,7 +167,7 @@
               <w:rPr>
                 <w:sz w:val="20"/>
               </w:rPr>
-              <w:t>Companía de Bomberos (1.ª Compañía) — Maipú, Chile</w:t>
+              <w:t xml:space="preserve">Compañía de Bomberos (1.ª Compañía) — Maipú, Chile</w:t>
             </w:r>
           </w:p>
         </w:tc>
@@ -185,7 +185,7 @@
               <w:rPr>
                 <w:sz w:val="20"/>
               </w:rPr>
-              <w:t>Versión del documento</w:t>
+              <w:t xml:space="preserve">Versión del documento</w:t>
             </w:r>
           </w:p>
         </w:tc>
@@ -198,7 +198,7 @@
               <w:rPr>
                 <w:sz w:val="20"/>
               </w:rPr>
-              <w:t>1.0</w:t>
+              <w:t xml:space="preserve">1.1</w:t>
             </w:r>
           </w:p>
         </w:tc>
@@ -216,7 +216,7 @@
               <w:rPr>
                 <w:sz w:val="20"/>
               </w:rPr>
-              <w:t>Fecha</w:t>
+              <w:t xml:space="preserve">Fecha</w:t>
             </w:r>
           </w:p>
         </w:tc>
@@ -229,7 +229,7 @@
               <w:rPr>
                 <w:sz w:val="20"/>
               </w:rPr>
-              <w:t>26 de septiembre de 2026</w:t>
+              <w:t xml:space="preserve">10 de octubre de 2026 (versión 1.0: 26 de septiembre de 2026)</w:t>
             </w:r>
           </w:p>
         </w:tc>
@@ -322,7 +322,7 @@
     </w:p>
     <w:p>
       <w:r>
-        <w:t>- Registrar y consultar los vehículos de la flota y su estado operativo.</w:t>
+        <w:t xml:space="preserve">- Registrar y consultar los vehículos de la flota y su estado operativo, que se actualiza automáticamente según sus fallas y mantenciones.</w:t>
       </w:r>
     </w:p>
     <w:p>
@@ -332,7 +332,7 @@
     </w:p>
     <w:p>
       <w:r>
-        <w:t>- Reportar fallas de vehículos y gestionar recordatorios de mantención.</w:t>
+        <w:t xml:space="preserve">- Reportar fallas de vehículos, derivarlas al Inspector de Material Mayor y alertar las mantenciones preventivas (cada 6 meses).</w:t>
       </w:r>
     </w:p>
     <w:p>
@@ -343,6 +343,11 @@
     <w:p>
       <w:r>
         <w:t>- Generar reportería de costos de mantención con exportación a PDF.</w:t>
+      </w:r>
+    </w:p>
+    <w:p>
+      <w:r>
+        <w:t xml:space="preserve">- Separar la información por compañía: cada usuario ve solo la de su compañía y el administrador puede revisarlas todas.</w:t>
       </w:r>
     </w:p>
     <w:p>
@@ -580,7 +585,7 @@
               <w:rPr>
                 <w:sz w:val="20"/>
               </w:rPr>
-              <w:t>Mantención preventiva</w:t>
+              <w:t xml:space="preserve">Mantención preventiva</w:t>
             </w:r>
           </w:p>
         </w:tc>
@@ -593,7 +598,7 @@
               <w:rPr>
                 <w:sz w:val="20"/>
               </w:rPr>
-              <w:t>Mantención programada según periodos o kilometraje</w:t>
+              <w:t xml:space="preserve">Mantención programada cada 6 meses, contados desde la fecha de salida de la última mantención preventiva</w:t>
             </w:r>
           </w:p>
         </w:tc>
@@ -687,6 +692,130 @@
                 <w:sz w:val="20"/>
               </w:rPr>
               <w:t>Unidad de competencia</w:t>
+            </w:r>
+          </w:p>
+        </w:tc>
+      </w:tr>
+      <w:tr>
+        <w:trPr>
+          <w:jc w:val="center"/>
+        </w:trPr>
+        <w:tc>
+          <w:tcPr>
+            <w:tcW w:w="4703" w:type="dxa"/>
+          </w:tcPr>
+          <w:p>
+            <w:r>
+              <w:rPr>
+                <w:sz w:val="20"/>
+              </w:rPr>
+              <w:t xml:space="preserve">Derivación</w:t>
+            </w:r>
+          </w:p>
+        </w:tc>
+        <w:tc>
+          <w:tcPr>
+            <w:tcW w:w="4703" w:type="dxa"/>
+          </w:tcPr>
+          <w:p>
+            <w:r>
+              <w:rPr>
+                <w:sz w:val="20"/>
+              </w:rPr>
+              <w:t xml:space="preserve">Acción del Teniente Tercero que traspasa un reporte de falla al Inspector de Material Mayor para su mantención</w:t>
+            </w:r>
+          </w:p>
+        </w:tc>
+      </w:tr>
+      <w:tr>
+        <w:trPr>
+          <w:jc w:val="center"/>
+        </w:trPr>
+        <w:tc>
+          <w:tcPr>
+            <w:tcW w:w="4703" w:type="dxa"/>
+          </w:tcPr>
+          <w:p>
+            <w:r>
+              <w:rPr>
+                <w:sz w:val="20"/>
+              </w:rPr>
+              <w:t xml:space="preserve">JWT</w:t>
+            </w:r>
+          </w:p>
+        </w:tc>
+        <w:tc>
+          <w:tcPr>
+            <w:tcW w:w="4703" w:type="dxa"/>
+          </w:tcPr>
+          <w:p>
+            <w:r>
+              <w:rPr>
+                <w:sz w:val="20"/>
+              </w:rPr>
+              <w:t xml:space="preserve">JSON Web Token: credencial firmada que identifica la sesión del usuario</w:t>
+            </w:r>
+          </w:p>
+        </w:tc>
+      </w:tr>
+      <w:tr>
+        <w:trPr>
+          <w:jc w:val="center"/>
+        </w:trPr>
+        <w:tc>
+          <w:tcPr>
+            <w:tcW w:w="4703" w:type="dxa"/>
+          </w:tcPr>
+          <w:p>
+            <w:r>
+              <w:rPr>
+                <w:sz w:val="20"/>
+              </w:rPr>
+              <w:t xml:space="preserve">RUT</w:t>
+            </w:r>
+          </w:p>
+        </w:tc>
+        <w:tc>
+          <w:tcPr>
+            <w:tcW w:w="4703" w:type="dxa"/>
+          </w:tcPr>
+          <w:p>
+            <w:r>
+              <w:rPr>
+                <w:sz w:val="20"/>
+              </w:rPr>
+              <w:t xml:space="preserve">Rol Único Tributario; se valida con su dígito verificador (módulo 11)</w:t>
+            </w:r>
+          </w:p>
+        </w:tc>
+      </w:tr>
+      <w:tr>
+        <w:trPr>
+          <w:jc w:val="center"/>
+        </w:trPr>
+        <w:tc>
+          <w:tcPr>
+            <w:tcW w:w="4703" w:type="dxa"/>
+          </w:tcPr>
+          <w:p>
+            <w:r>
+              <w:rPr>
+                <w:sz w:val="20"/>
+              </w:rPr>
+              <w:t xml:space="preserve">Supabase</w:t>
+            </w:r>
+          </w:p>
+        </w:tc>
+        <w:tc>
+          <w:tcPr>
+            <w:tcW w:w="4703" w:type="dxa"/>
+          </w:tcPr>
+          <w:p>
+            <w:r>
+              <w:rPr>
+                <w:sz w:val="20"/>
+              </w:rPr>
+              <w:t xml:space="preserve">Plataforma sobre PostgreSQL; en desarrollo se ejecuta localmente con Supabase CLI</w:t>
             </w:r>
           </w:p>
         </w:tc>
@@ -717,12 +846,22 @@
     </w:p>
     <w:p>
       <w:r>
-        <w:t>- Modelo de datos: `backend/schema.sql` y `backend/seed.sql`</w:t>
+        <w:t xml:space="preserve">- Modelo de datos: migraciones en `Backend/supabase/migrations/` y datos iniciales en `Backend/supabase/seed.sql`</w:t>
       </w:r>
     </w:p>
     <w:p>
       <w:r>
         <w:t>- Repositorio: `proyecto-capstone/Fase 2`</w:t>
+      </w:r>
+    </w:p>
+    <w:p>
+      <w:r>
+        <w:t xml:space="preserve">- Product Backlog (HU01 a HU17) y Plan de Pruebas: `Evidencias/docs/Plan_de_Pruebas_Bomberos_completado.xlsx`</w:t>
+      </w:r>
+    </w:p>
+    <w:p>
+      <w:r>
+        <w:t xml:space="preserve">- Instalación y ejecución del entorno: `Fase 2/README.md`</w:t>
       </w:r>
     </w:p>
     <w:p>
@@ -740,7 +879,7 @@
     </w:p>
     <w:p>
       <w:r>
-        <w:t>El resto del documento describe la perspectiva general del sistema (apartado 2), los requisitos funcionales y no funcionales (apartado 3), la matriz de trazabilidad (apartado 4) y el modelo de datos (apartado 5).</w:t>
+        <w:t xml:space="preserve">El resto del documento describe la perspectiva general del sistema (apartado 2), los requisitos funcionales (apartado 3) y no funcionales (apartado 4), el modelo de datos (apartado 5), la trazabilidad de requisitos (apartado 6) y los criterios de verificación y aceptación (apartado 7).</w:t>
       </w:r>
     </w:p>
     <w:p>
@@ -901,7 +1040,7 @@
           <w:color w:val="444444"/>
           <w:sz w:val="18"/>
         </w:rPr>
-        <w:t>Node.js + Express   ───▶  PostgreSQL</w:t>
+        <w:t>Node.js + Express   ───▶  PostgreSQL (Supabase)</w:t>
       </w:r>
       <w:r>
         <w:rPr>
@@ -924,13 +1063,12 @@
     </w:p>
     <w:p>
       <w:r>
-        <w:t>- La base de datos (PostgreSQL) se ejecuta en un contenedor Docker con volumen persistente (`pgdata`) y se inicializa automáticamente con los scripts `01-schema.sql` y `02-seed.sql`.</w:t>
+        <w:t xml:space="preserve">- La base de datos (PostgreSQL de Supabase) se ejecuta localmente con Supabase CLI (`npx supabase start`, proyecto `sigmave`), que la levanta en contenedores Docker y aplica las migraciones de `supabase/migrations/` y luego `supabase/seed.sql`.</w:t>
       </w:r>
     </w:p>
     <w:p>
       <w:r>
-        <w:lastRenderedPageBreak/>
-        <w:t>El entorno se despliega con Docker Compose en tres servicios: `capstone-db-1` (base de datos, puerto host 5434), `capstone-server-1` (API, puerto 3000) y `capstone-web-dev-1` (frontend Vite, puerto 5173 con proxy hacia la API).</w:t>
+        <w:t xml:space="preserve">La API y el frontend se despliegan con Docker Compose en dos stacks independientes: `capstone-api` (API, puerto 3000) y `capstone-web` (frontend Vite en el puerto 5173 con proxy hacia la API en desarrollo, o Nginx en el puerto 8080 en producción). La base de datos no forma parte de Compose: la administra Supabase CLI (Postgres en el puerto 55322 y Studio en el 55323).</w:t>
       </w:r>
     </w:p>
     <w:p>
@@ -948,27 +1086,27 @@
     </w:p>
     <w:p>
       <w:r>
-        <w:t>1. Autenticación y sesión: el usuario inicia sesión con email y contraseña; el backend valida contra la base de datos y devuelve el usuario con su rol. La sesión se persiste en `localStorage`.</w:t>
+        <w:t xml:space="preserve">1. Autenticación y sesión: el usuario inicia sesión con email y contraseña; el backend valida la contraseña (bcrypt) y entrega un token JWT en una cookie `httpOnly` que dura 8 horas. Al recargar la página, la sesión se recupera desde la API (`/api/auth/me`).</w:t>
       </w:r>
     </w:p>
     <w:p>
       <w:r>
-        <w:t>2. Gestión de vehículos: listado del estado de la flota, registro de nuevos vehículos, detalle por vehículo.</w:t>
+        <w:t xml:space="preserve">2. Gestión de vehículos: listado del estado de la flota, registro de nuevos vehículos y ficha por vehículo con su historial de mantenciones y fallas.</w:t>
       </w:r>
     </w:p>
     <w:p>
       <w:r>
-        <w:t>3. Gestión de mantenciones: registro de mantenciones preventivas y reactivas con fechas, kilometraje, detalle del trabajo, proveedor, costos (repuestos y mano de obra) y responsable.</w:t>
+        <w:t xml:space="preserve">3. Gestión de mantenciones: registro de mantenciones preventivas y reactivas con fechas, kilometraje, detalle del trabajo, taller, costos (repuestos y mano de obra, con el total calculado automáticamente) y responsable. Una mantención sin fecha de salida queda en proceso y se finaliza después.</w:t>
       </w:r>
     </w:p>
     <w:p>
       <w:r>
-        <w:t>4. Reporte de fallas: formulario de reporte y confirmación de fallas de un vehículo.</w:t>
+        <w:t xml:space="preserve">4. Reporte y derivación de fallas: el bombero reporta la falla con su urgencia y el vehículo queda no operativo; el Teniente Tercero ve los reportes ordenados por urgencia y los deriva al Inspector de Material Mayor, quien registra la mantención que los resuelve.</w:t>
       </w:r>
     </w:p>
     <w:p>
       <w:r>
-        <w:t>5. Alertas: recordatorios de mantención por fecha o kilometraje programado.</w:t>
+        <w:t xml:space="preserve">5. Alertas: cálculo automático de la próxima mantención preventiva (6 meses desde la última) con aviso 30 días antes, y listado de alertas priorizado (vencidas antes que próximas).</w:t>
       </w:r>
     </w:p>
     <w:p>
@@ -978,12 +1116,22 @@
     </w:p>
     <w:p>
       <w:r>
-        <w:t>7. Reportería: filtro de costos por periodo (generado desde fechas reales de mantenciones) y exportación a PDF.</w:t>
+        <w:t xml:space="preserve">7. Reportería: costos por vehículo filtrados por mes o por un rango de fechas personalizado, con exportación a PDF.</w:t>
       </w:r>
     </w:p>
     <w:p>
       <w:r>
         <w:t>8. Control de acceso por rol: navegación y acciones limitadas según la matriz de roles.</w:t>
+      </w:r>
+    </w:p>
+    <w:p>
+      <w:r>
+        <w:t xml:space="preserve">9. Separación por compañía: cada usuario ve solo los datos de su compañía; el administrador ve todas y puede filtrar por compañía con un selector.</w:t>
+      </w:r>
+    </w:p>
+    <w:p>
+      <w:r>
+        <w:t xml:space="preserve">10. Dashboard: cantidad de vehículos operativos, en mantención y no operativos, y de mantenciones preventivas próximas y vencidas.</w:t>
       </w:r>
     </w:p>
     <w:p>
@@ -1027,7 +1175,7 @@
                 <w:color w:val="FFFFFF"/>
                 <w:sz w:val="20"/>
               </w:rPr>
-              <w:t>Role</w:t>
+              <w:t xml:space="preserve">Rol</w:t>
             </w:r>
           </w:p>
         </w:tc>
@@ -1043,7 +1191,7 @@
                 <w:color w:val="FFFFFF"/>
                 <w:sz w:val="20"/>
               </w:rPr>
-              <w:t>Descripción</w:t>
+              <w:t xml:space="preserve">Descripción</w:t>
             </w:r>
           </w:p>
         </w:tc>
@@ -1059,7 +1207,7 @@
                 <w:color w:val="FFFFFF"/>
                 <w:sz w:val="20"/>
               </w:rPr>
-              <w:t>Acceso principal</w:t>
+              <w:t xml:space="preserve">Acceso principal</w:t>
             </w:r>
           </w:p>
         </w:tc>
@@ -1121,7 +1269,7 @@
               <w:rPr>
                 <w:sz w:val="20"/>
               </w:rPr>
-              <w:t>Teniente Tercero</w:t>
+              <w:t xml:space="preserve">Teniente Tercero</w:t>
             </w:r>
           </w:p>
         </w:tc>
@@ -1134,7 +1282,7 @@
               <w:rPr>
                 <w:sz w:val="20"/>
               </w:rPr>
-              <w:t>Oficial a cargo de material</w:t>
+              <w:t xml:space="preserve">Oficial a cargo de material</w:t>
             </w:r>
           </w:p>
         </w:tc>
@@ -1147,7 +1295,7 @@
               <w:rPr>
                 <w:sz w:val="20"/>
               </w:rPr>
-              <w:t>Lo anterior + registrar mantenciones</w:t>
+              <w:t xml:space="preserve">Lo anterior + panel de fallas (derivar reportes) y registrar mantenciones</w:t>
             </w:r>
           </w:p>
         </w:tc>
@@ -1209,7 +1357,7 @@
               <w:rPr>
                 <w:sz w:val="20"/>
               </w:rPr>
-              <w:t>Administrador</w:t>
+              <w:t xml:space="preserve">Administrador</w:t>
             </w:r>
           </w:p>
         </w:tc>
@@ -1222,7 +1370,7 @@
               <w:rPr>
                 <w:sz w:val="20"/>
               </w:rPr>
-              <w:t>Gestión integral del sistema</w:t>
+              <w:t xml:space="preserve">Gestión integral del sistema</w:t>
             </w:r>
           </w:p>
         </w:tc>
@@ -1235,7 +1383,7 @@
               <w:rPr>
                 <w:sz w:val="20"/>
               </w:rPr>
-              <w:t>Todos los módulos, incluida gestión de usuarios</w:t>
+              <w:t xml:space="preserve">Todos los módulos, incluida gestión de usuarios y selector de compañía</w:t>
             </w:r>
           </w:p>
         </w:tc>
@@ -1256,7 +1404,7 @@
     </w:p>
     <w:p>
       <w:r>
-        <w:t>- Servidores: contenedores Docker (Compose v3) sobre Windows o Linux.</w:t>
+        <w:t xml:space="preserve">- Servidores: contenedores Docker (Docker Compose y Supabase CLI) sobre Windows o Linux; Node.js 22 para ejecutar la API y el frontend sin contenedores.</w:t>
       </w:r>
     </w:p>
     <w:p>
@@ -1271,7 +1419,7 @@
     </w:p>
     <w:p>
       <w:r>
-        <w:t>- Puertos: base de datos 5434 (host), API 3000, frontend 5173 (desarrollo) y 80/443 (producción con Nginx).</w:t>
+        <w:t xml:space="preserve">- Puertos: frontend 5173 (desarrollo) y 8080 (producción con Nginx), API 3000, base de datos 55322, Supabase Studio 55323 y API de Supabase 55321 (rango 553xx para no chocar con otros proyectos Supabase).</w:t>
       </w:r>
     </w:p>
     <w:p>
@@ -1294,8 +1442,12 @@
     </w:p>
     <w:p>
       <w:r>
-        <w:lastRenderedPageBreak/>
-        <w:t>- Las contraseñas se almacenan con hash (bcrypt); nunca en texto plano.</w:t>
+        <w:t xml:space="preserve">- Un reporte de falla solo admite los estados `pendiente`, `derivado` y `resuelto`; una mantención queda `en_proceso` (sin fecha de salida) o `finalizada` (con fecha de salida no anterior a la de ingreso).</w:t>
+      </w:r>
+    </w:p>
+    <w:p>
+      <w:r>
+        <w:t xml:space="preserve">- Las contraseñas se almacenan con hash (bcrypt); nunca en texto plano. La base de datos lo exige con una restricción CHECK.</w:t>
       </w:r>
     </w:p>
     <w:p>
@@ -1305,7 +1457,7 @@
     </w:p>
     <w:p>
       <w:r>
-        <w:t>- El backend define restricciones de unicidad en `rut` y `email` de los usuarios, y en `nomenclatura` de los vehículos.</w:t>
+        <w:t xml:space="preserve">- La base de datos define restricciones de unicidad en `rut` y `email` de los usuarios. La unicidad de `nomenclatura` de los vehículos aún no está implementada.</w:t>
       </w:r>
     </w:p>
     <w:p>
@@ -1338,7 +1490,12 @@
     </w:p>
     <w:p>
       <w:r>
-        <w:t>- Los scripts de inicialización de la base de datos se ejecutan en orden numérico (`01-schema.sql` antes de `02-seed.sql`).</w:t>
+        <w:t xml:space="preserve">- Las migraciones de la base de datos se aplican en orden cronológico (prefijo de fecha en `supabase/migrations/`) y después se carga `supabase/seed.sql`.</w:t>
+      </w:r>
+    </w:p>
+    <w:p>
+      <w:r>
+        <w:t xml:space="preserve">- Docker Desktop debe estar en ejecución para levantar la base de datos local.</w:t>
       </w:r>
     </w:p>
     <w:p>
@@ -1467,46 +1624,46 @@
               <w:rPr>
                 <w:sz w:val="20"/>
               </w:rPr>
-              <w:t>RF-01</w:t>
-            </w:r>
-          </w:p>
-        </w:tc>
-        <w:tc>
-          <w:tcPr>
-            <w:tcW w:w="2351" w:type="dxa"/>
-          </w:tcPr>
-          <w:p>
-            <w:r>
-              <w:rPr>
-                <w:sz w:val="20"/>
-              </w:rPr>
-              <w:t>El sistema debe validar credenciales (email y contraseña) contra la base de datos y devolver el usuario autenticado con su `nombre_rol`.</w:t>
-            </w:r>
-          </w:p>
-        </w:tc>
-        <w:tc>
-          <w:tcPr>
-            <w:tcW w:w="2351" w:type="dxa"/>
-          </w:tcPr>
-          <w:p>
-            <w:r>
-              <w:rPr>
-                <w:sz w:val="20"/>
-              </w:rPr>
-              <w:t>Alta</w:t>
-            </w:r>
-          </w:p>
-        </w:tc>
-        <w:tc>
-          <w:tcPr>
-            <w:tcW w:w="2351" w:type="dxa"/>
-          </w:tcPr>
-          <w:p>
-            <w:r>
-              <w:rPr>
-                <w:sz w:val="20"/>
-              </w:rPr>
-              <w:t>Todos</w:t>
+              <w:t xml:space="preserve">RF-01</w:t>
+            </w:r>
+          </w:p>
+        </w:tc>
+        <w:tc>
+          <w:tcPr>
+            <w:tcW w:w="2351" w:type="dxa"/>
+          </w:tcPr>
+          <w:p>
+            <w:r>
+              <w:rPr>
+                <w:sz w:val="20"/>
+              </w:rPr>
+              <w:t xml:space="preserve">El sistema debe validar credenciales (email y contraseña) contra la base de datos y devolver el usuario autenticado con su `nombre_rol` y su compañía, entregando la sesión en un token JWT (cookie `httpOnly`, `SameSite=Strict`).</w:t>
+            </w:r>
+          </w:p>
+        </w:tc>
+        <w:tc>
+          <w:tcPr>
+            <w:tcW w:w="2351" w:type="dxa"/>
+          </w:tcPr>
+          <w:p>
+            <w:r>
+              <w:rPr>
+                <w:sz w:val="20"/>
+              </w:rPr>
+              <w:t xml:space="preserve">Alta</w:t>
+            </w:r>
+          </w:p>
+        </w:tc>
+        <w:tc>
+          <w:tcPr>
+            <w:tcW w:w="2351" w:type="dxa"/>
+          </w:tcPr>
+          <w:p>
+            <w:r>
+              <w:rPr>
+                <w:sz w:val="20"/>
+              </w:rPr>
+              <w:t xml:space="preserve">Todos</w:t>
             </w:r>
           </w:p>
         </w:tc>
@@ -1581,46 +1738,46 @@
               <w:rPr>
                 <w:sz w:val="20"/>
               </w:rPr>
-              <w:t>RF-03</w:t>
-            </w:r>
-          </w:p>
-        </w:tc>
-        <w:tc>
-          <w:tcPr>
-            <w:tcW w:w="2351" w:type="dxa"/>
-          </w:tcPr>
-          <w:p>
-            <w:r>
-              <w:rPr>
-                <w:sz w:val="20"/>
-              </w:rPr>
-              <w:t>El sistema debe persistir la sesión del usuario (clave `sigmave_user` en `localStorage`) para que no se pierda al recargar la página.</w:t>
-            </w:r>
-          </w:p>
-        </w:tc>
-        <w:tc>
-          <w:tcPr>
-            <w:tcW w:w="2351" w:type="dxa"/>
-          </w:tcPr>
-          <w:p>
-            <w:r>
-              <w:rPr>
-                <w:sz w:val="20"/>
-              </w:rPr>
-              <w:t>Alta</w:t>
-            </w:r>
-          </w:p>
-        </w:tc>
-        <w:tc>
-          <w:tcPr>
-            <w:tcW w:w="2351" w:type="dxa"/>
-          </w:tcPr>
-          <w:p>
-            <w:r>
-              <w:rPr>
-                <w:sz w:val="20"/>
-              </w:rPr>
-              <w:t>Todos</w:t>
+              <w:t xml:space="preserve">RF-03</w:t>
+            </w:r>
+          </w:p>
+        </w:tc>
+        <w:tc>
+          <w:tcPr>
+            <w:tcW w:w="2351" w:type="dxa"/>
+          </w:tcPr>
+          <w:p>
+            <w:r>
+              <w:rPr>
+                <w:sz w:val="20"/>
+              </w:rPr>
+              <w:t xml:space="preserve">El sistema debe mantener la sesión al recargar la página: la cookie de sesión dura 8 horas y el frontend recupera el usuario con `GET /api/auth/me` (el usuario no se guarda en `localStorage`).</w:t>
+            </w:r>
+          </w:p>
+        </w:tc>
+        <w:tc>
+          <w:tcPr>
+            <w:tcW w:w="2351" w:type="dxa"/>
+          </w:tcPr>
+          <w:p>
+            <w:r>
+              <w:rPr>
+                <w:sz w:val="20"/>
+              </w:rPr>
+              <w:t xml:space="preserve">Alta</w:t>
+            </w:r>
+          </w:p>
+        </w:tc>
+        <w:tc>
+          <w:tcPr>
+            <w:tcW w:w="2351" w:type="dxa"/>
+          </w:tcPr>
+          <w:p>
+            <w:r>
+              <w:rPr>
+                <w:sz w:val="20"/>
+              </w:rPr>
+              <w:t xml:space="preserve">Todos</w:t>
             </w:r>
           </w:p>
         </w:tc>
@@ -1638,46 +1795,46 @@
               <w:rPr>
                 <w:sz w:val="20"/>
               </w:rPr>
-              <w:t>RF-04</w:t>
-            </w:r>
-          </w:p>
-        </w:tc>
-        <w:tc>
-          <w:tcPr>
-            <w:tcW w:w="2351" w:type="dxa"/>
-          </w:tcPr>
-          <w:p>
-            <w:r>
-              <w:rPr>
-                <w:sz w:val="20"/>
-              </w:rPr>
-              <w:t>El sistema debe permitir cerrar sesión, limpiando la sesión y redirigiendo al login.</w:t>
-            </w:r>
-          </w:p>
-        </w:tc>
-        <w:tc>
-          <w:tcPr>
-            <w:tcW w:w="2351" w:type="dxa"/>
-          </w:tcPr>
-          <w:p>
-            <w:r>
-              <w:rPr>
-                <w:sz w:val="20"/>
-              </w:rPr>
-              <w:t>Alta</w:t>
-            </w:r>
-          </w:p>
-        </w:tc>
-        <w:tc>
-          <w:tcPr>
-            <w:tcW w:w="2351" w:type="dxa"/>
-          </w:tcPr>
-          <w:p>
-            <w:r>
-              <w:rPr>
-                <w:sz w:val="20"/>
-              </w:rPr>
-              <w:t>Todos</w:t>
+              <w:t xml:space="preserve">RF-04</w:t>
+            </w:r>
+          </w:p>
+        </w:tc>
+        <w:tc>
+          <w:tcPr>
+            <w:tcW w:w="2351" w:type="dxa"/>
+          </w:tcPr>
+          <w:p>
+            <w:r>
+              <w:rPr>
+                <w:sz w:val="20"/>
+              </w:rPr>
+              <w:t xml:space="preserve">El sistema debe permitir cerrar sesión, eliminando la cookie de sesión (`POST /api/auth/logout`) y redirigiendo al login.</w:t>
+            </w:r>
+          </w:p>
+        </w:tc>
+        <w:tc>
+          <w:tcPr>
+            <w:tcW w:w="2351" w:type="dxa"/>
+          </w:tcPr>
+          <w:p>
+            <w:r>
+              <w:rPr>
+                <w:sz w:val="20"/>
+              </w:rPr>
+              <w:t xml:space="preserve">Alta</w:t>
+            </w:r>
+          </w:p>
+        </w:tc>
+        <w:tc>
+          <w:tcPr>
+            <w:tcW w:w="2351" w:type="dxa"/>
+          </w:tcPr>
+          <w:p>
+            <w:r>
+              <w:rPr>
+                <w:sz w:val="20"/>
+              </w:rPr>
+              <w:t xml:space="preserve">Todos</w:t>
             </w:r>
           </w:p>
         </w:tc>
@@ -2020,46 +2177,46 @@
               <w:rPr>
                 <w:sz w:val="20"/>
               </w:rPr>
-              <w:t>RF-09</w:t>
-            </w:r>
-          </w:p>
-        </w:tc>
-        <w:tc>
-          <w:tcPr>
-            <w:tcW w:w="2351" w:type="dxa"/>
-          </w:tcPr>
-          <w:p>
-            <w:r>
-              <w:rPr>
-                <w:sz w:val="20"/>
-              </w:rPr>
-              <w:t>El sistema debe permitir reportar una falla sobre un vehículo y confirmarla.</w:t>
-            </w:r>
-          </w:p>
-        </w:tc>
-        <w:tc>
-          <w:tcPr>
-            <w:tcW w:w="2351" w:type="dxa"/>
-          </w:tcPr>
-          <w:p>
-            <w:r>
-              <w:rPr>
-                <w:sz w:val="20"/>
-              </w:rPr>
-              <w:t>Media</w:t>
-            </w:r>
-          </w:p>
-        </w:tc>
-        <w:tc>
-          <w:tcPr>
-            <w:tcW w:w="2351" w:type="dxa"/>
-          </w:tcPr>
-          <w:p>
-            <w:r>
-              <w:rPr>
-                <w:sz w:val="20"/>
-              </w:rPr>
-              <w:t>Todos</w:t>
+              <w:t xml:space="preserve">RF-09</w:t>
+            </w:r>
+          </w:p>
+        </w:tc>
+        <w:tc>
+          <w:tcPr>
+            <w:tcW w:w="2351" w:type="dxa"/>
+          </w:tcPr>
+          <w:p>
+            <w:r>
+              <w:rPr>
+                <w:sz w:val="20"/>
+              </w:rPr>
+              <w:t xml:space="preserve">El sistema debe permitir reportar una falla sobre un vehículo indicando la urgencia (alta, media o baja) y una descripción obligatoria, y confirmar el envío con el número de reporte.</w:t>
+            </w:r>
+          </w:p>
+        </w:tc>
+        <w:tc>
+          <w:tcPr>
+            <w:tcW w:w="2351" w:type="dxa"/>
+          </w:tcPr>
+          <w:p>
+            <w:r>
+              <w:rPr>
+                <w:sz w:val="20"/>
+              </w:rPr>
+              <w:t xml:space="preserve">Media</w:t>
+            </w:r>
+          </w:p>
+        </w:tc>
+        <w:tc>
+          <w:tcPr>
+            <w:tcW w:w="2351" w:type="dxa"/>
+          </w:tcPr>
+          <w:p>
+            <w:r>
+              <w:rPr>
+                <w:sz w:val="20"/>
+              </w:rPr>
+              <w:t xml:space="preserve">Todos</w:t>
             </w:r>
           </w:p>
         </w:tc>
@@ -2287,46 +2444,46 @@
               <w:rPr>
                 <w:sz w:val="20"/>
               </w:rPr>
-              <w:t>RF-12</w:t>
-            </w:r>
-          </w:p>
-        </w:tc>
-        <w:tc>
-          <w:tcPr>
-            <w:tcW w:w="2351" w:type="dxa"/>
-          </w:tcPr>
-          <w:p>
-            <w:r>
-              <w:rPr>
-                <w:sz w:val="20"/>
-              </w:rPr>
-              <w:t>El sistema debe permitir registrar una mantención con: fecha de ingreso (obligatoria), fecha de salida, kilometraje de ingreso, detalle del trabajo, proveedor, costo total, mano de obra, tipo de mantención, vehículo y usuario responsable.</w:t>
-            </w:r>
-          </w:p>
-        </w:tc>
-        <w:tc>
-          <w:tcPr>
-            <w:tcW w:w="2351" w:type="dxa"/>
-          </w:tcPr>
-          <w:p>
-            <w:r>
-              <w:rPr>
-                <w:sz w:val="20"/>
-              </w:rPr>
-              <w:t>Alta</w:t>
-            </w:r>
-          </w:p>
-        </w:tc>
-        <w:tc>
-          <w:tcPr>
-            <w:tcW w:w="2351" w:type="dxa"/>
-          </w:tcPr>
-          <w:p>
-            <w:r>
-              <w:rPr>
-                <w:sz w:val="20"/>
-              </w:rPr>
-              <w:t>Teniente Tercero, Inspector, Admin</w:t>
+              <w:t xml:space="preserve">RF-12</w:t>
+            </w:r>
+          </w:p>
+        </w:tc>
+        <w:tc>
+          <w:tcPr>
+            <w:tcW w:w="2351" w:type="dxa"/>
+          </w:tcPr>
+          <w:p>
+            <w:r>
+              <w:rPr>
+                <w:sz w:val="20"/>
+              </w:rPr>
+              <w:t xml:space="preserve">El sistema debe permitir registrar una mantención con: fecha de ingreso (obligatoria), fecha de salida, kilometraje de ingreso, detalle del trabajo, taller (proveedor), costo de repuestos, mano de obra, tipo de mantención, vehículo y, en las reactivas, el reporte de falla que resuelve. El responsable es el usuario que la registra.</w:t>
+            </w:r>
+          </w:p>
+        </w:tc>
+        <w:tc>
+          <w:tcPr>
+            <w:tcW w:w="2351" w:type="dxa"/>
+          </w:tcPr>
+          <w:p>
+            <w:r>
+              <w:rPr>
+                <w:sz w:val="20"/>
+              </w:rPr>
+              <w:t xml:space="preserve">Alta</w:t>
+            </w:r>
+          </w:p>
+        </w:tc>
+        <w:tc>
+          <w:tcPr>
+            <w:tcW w:w="2351" w:type="dxa"/>
+          </w:tcPr>
+          <w:p>
+            <w:r>
+              <w:rPr>
+                <w:sz w:val="20"/>
+              </w:rPr>
+              <w:t xml:space="preserve">Teniente Tercero, Inspector, Admin</w:t>
             </w:r>
           </w:p>
         </w:tc>
@@ -2344,47 +2501,46 @@
               <w:rPr>
                 <w:sz w:val="20"/>
               </w:rPr>
-              <w:lastRenderedPageBreak/>
-              <w:t>RF-13</w:t>
-            </w:r>
-          </w:p>
-        </w:tc>
-        <w:tc>
-          <w:tcPr>
-            <w:tcW w:w="2351" w:type="dxa"/>
-          </w:tcPr>
-          <w:p>
-            <w:r>
-              <w:rPr>
-                <w:sz w:val="20"/>
-              </w:rPr>
-              <w:t>El sistema debe validar que la fecha de salida no sea anterior a la fecha de ingreso.</w:t>
-            </w:r>
-          </w:p>
-        </w:tc>
-        <w:tc>
-          <w:tcPr>
-            <w:tcW w:w="2351" w:type="dxa"/>
-          </w:tcPr>
-          <w:p>
-            <w:r>
-              <w:rPr>
-                <w:sz w:val="20"/>
-              </w:rPr>
-              <w:t>Media</w:t>
-            </w:r>
-          </w:p>
-        </w:tc>
-        <w:tc>
-          <w:tcPr>
-            <w:tcW w:w="2351" w:type="dxa"/>
-          </w:tcPr>
-          <w:p>
-            <w:r>
-              <w:rPr>
-                <w:sz w:val="20"/>
-              </w:rPr>
-              <w:t>Teniente Tercero, Inspector, Admin</w:t>
+              <w:t xml:space="preserve">RF-13</w:t>
+            </w:r>
+          </w:p>
+        </w:tc>
+        <w:tc>
+          <w:tcPr>
+            <w:tcW w:w="2351" w:type="dxa"/>
+          </w:tcPr>
+          <w:p>
+            <w:r>
+              <w:rPr>
+                <w:sz w:val="20"/>
+              </w:rPr>
+              <w:t xml:space="preserve">El sistema debe validar que la fecha de salida no sea anterior a la fecha de ingreso ni posterior a la fecha actual.</w:t>
+            </w:r>
+          </w:p>
+        </w:tc>
+        <w:tc>
+          <w:tcPr>
+            <w:tcW w:w="2351" w:type="dxa"/>
+          </w:tcPr>
+          <w:p>
+            <w:r>
+              <w:rPr>
+                <w:sz w:val="20"/>
+              </w:rPr>
+              <w:t xml:space="preserve">Media</w:t>
+            </w:r>
+          </w:p>
+        </w:tc>
+        <w:tc>
+          <w:tcPr>
+            <w:tcW w:w="2351" w:type="dxa"/>
+          </w:tcPr>
+          <w:p>
+            <w:r>
+              <w:rPr>
+                <w:sz w:val="20"/>
+              </w:rPr>
+              <w:t xml:space="preserve">Teniente Tercero, Inspector, Admin</w:t>
             </w:r>
           </w:p>
         </w:tc>
@@ -2459,46 +2615,46 @@
               <w:rPr>
                 <w:sz w:val="20"/>
               </w:rPr>
-              <w:t>RF-15</w:t>
-            </w:r>
-          </w:p>
-        </w:tc>
-        <w:tc>
-          <w:tcPr>
-            <w:tcW w:w="2351" w:type="dxa"/>
-          </w:tcPr>
-          <w:p>
-            <w:r>
-              <w:rPr>
-                <w:sz w:val="20"/>
-              </w:rPr>
-              <w:t>El sistema debe incorporar el costo de **mano de obra** como dato propio de la mantención para el cálculo de costos.</w:t>
-            </w:r>
-          </w:p>
-        </w:tc>
-        <w:tc>
-          <w:tcPr>
-            <w:tcW w:w="2351" w:type="dxa"/>
-          </w:tcPr>
-          <w:p>
-            <w:r>
-              <w:rPr>
-                <w:sz w:val="20"/>
-              </w:rPr>
-              <w:t>Alta</w:t>
-            </w:r>
-          </w:p>
-        </w:tc>
-        <w:tc>
-          <w:tcPr>
-            <w:tcW w:w="2351" w:type="dxa"/>
-          </w:tcPr>
-          <w:p>
-            <w:r>
-              <w:rPr>
-                <w:sz w:val="20"/>
-              </w:rPr>
-              <w:t>Teniente Tercero, Inspector, Admin</w:t>
+              <w:t xml:space="preserve">RF-15</w:t>
+            </w:r>
+          </w:p>
+        </w:tc>
+        <w:tc>
+          <w:tcPr>
+            <w:tcW w:w="2351" w:type="dxa"/>
+          </w:tcPr>
+          <w:p>
+            <w:r>
+              <w:rPr>
+                <w:sz w:val="20"/>
+              </w:rPr>
+              <w:t xml:space="preserve">El sistema debe registrar el costo de mano de obra como dato propio de la mantención y calcular el costo total como repuestos + mano de obra (el cálculo lo hace la API).</w:t>
+            </w:r>
+          </w:p>
+        </w:tc>
+        <w:tc>
+          <w:tcPr>
+            <w:tcW w:w="2351" w:type="dxa"/>
+          </w:tcPr>
+          <w:p>
+            <w:r>
+              <w:rPr>
+                <w:sz w:val="20"/>
+              </w:rPr>
+              <w:t xml:space="preserve">Alta</w:t>
+            </w:r>
+          </w:p>
+        </w:tc>
+        <w:tc>
+          <w:tcPr>
+            <w:tcW w:w="2351" w:type="dxa"/>
+          </w:tcPr>
+          <w:p>
+            <w:r>
+              <w:rPr>
+                <w:sz w:val="20"/>
+              </w:rPr>
+              <w:t xml:space="preserve">Teniente Tercero, Inspector, Admin</w:t>
             </w:r>
           </w:p>
         </w:tc>
@@ -2669,46 +2825,46 @@
               <w:rPr>
                 <w:sz w:val="20"/>
               </w:rPr>
-              <w:t>RF-17</w:t>
-            </w:r>
-          </w:p>
-        </w:tc>
-        <w:tc>
-          <w:tcPr>
-            <w:tcW w:w="2351" w:type="dxa"/>
-          </w:tcPr>
-          <w:p>
-            <w:r>
-              <w:rPr>
-                <w:sz w:val="20"/>
-              </w:rPr>
-              <w:t>El administrador debe poder crear usuarios con `rut`, `nombre_completo`, `email`, `password`, `id_rol` e `id_compania`, todos validados.</w:t>
-            </w:r>
-          </w:p>
-        </w:tc>
-        <w:tc>
-          <w:tcPr>
-            <w:tcW w:w="2351" w:type="dxa"/>
-          </w:tcPr>
-          <w:p>
-            <w:r>
-              <w:rPr>
-                <w:sz w:val="20"/>
-              </w:rPr>
-              <w:t>Alta</w:t>
-            </w:r>
-          </w:p>
-        </w:tc>
-        <w:tc>
-          <w:tcPr>
-            <w:tcW w:w="2351" w:type="dxa"/>
-          </w:tcPr>
-          <w:p>
-            <w:r>
-              <w:rPr>
-                <w:sz w:val="20"/>
-              </w:rPr>
-              <w:t>Admin</w:t>
+              <w:t xml:space="preserve">RF-17</w:t>
+            </w:r>
+          </w:p>
+        </w:tc>
+        <w:tc>
+          <w:tcPr>
+            <w:tcW w:w="2351" w:type="dxa"/>
+          </w:tcPr>
+          <w:p>
+            <w:r>
+              <w:rPr>
+                <w:sz w:val="20"/>
+              </w:rPr>
+              <w:t xml:space="preserve">El administrador debe poder crear usuarios con `rut`, `nombre_completo`, `email`, `password`, `id_rol` e `id_compania`, todos validados; el RUT se valida con su dígito verificador y se guarda normalizado (p. ej. `12345678-5`).</w:t>
+            </w:r>
+          </w:p>
+        </w:tc>
+        <w:tc>
+          <w:tcPr>
+            <w:tcW w:w="2351" w:type="dxa"/>
+          </w:tcPr>
+          <w:p>
+            <w:r>
+              <w:rPr>
+                <w:sz w:val="20"/>
+              </w:rPr>
+              <w:t xml:space="preserve">Alta</w:t>
+            </w:r>
+          </w:p>
+        </w:tc>
+        <w:tc>
+          <w:tcPr>
+            <w:tcW w:w="2351" w:type="dxa"/>
+          </w:tcPr>
+          <w:p>
+            <w:r>
+              <w:rPr>
+                <w:sz w:val="20"/>
+              </w:rPr>
+              <w:t xml:space="preserve">Admin</w:t>
             </w:r>
           </w:p>
         </w:tc>
@@ -3651,6 +3807,76 @@
               <w:rPr>
                 <w:sz w:val="20"/>
               </w:rPr>
+              <w:t xml:space="preserve">Panel de fallas</w:t>
+            </w:r>
+          </w:p>
+        </w:tc>
+        <w:tc>
+          <w:tcPr>
+            <w:tcW w:w="1881" w:type="dxa"/>
+          </w:tcPr>
+          <w:p>
+            <w:r>
+              <w:rPr>
+                <w:sz w:val="20"/>
+              </w:rPr>
+              <w:t xml:space="preserve">No</w:t>
+            </w:r>
+          </w:p>
+        </w:tc>
+        <w:tc>
+          <w:tcPr>
+            <w:tcW w:w="1881" w:type="dxa"/>
+          </w:tcPr>
+          <w:p>
+            <w:r>
+              <w:rPr>
+                <w:sz w:val="20"/>
+              </w:rPr>
+              <w:t xml:space="preserve">Sí</w:t>
+            </w:r>
+          </w:p>
+        </w:tc>
+        <w:tc>
+          <w:tcPr>
+            <w:tcW w:w="1881" w:type="dxa"/>
+          </w:tcPr>
+          <w:p>
+            <w:r>
+              <w:rPr>
+                <w:sz w:val="20"/>
+              </w:rPr>
+              <w:t xml:space="preserve">Sí</w:t>
+            </w:r>
+          </w:p>
+        </w:tc>
+        <w:tc>
+          <w:tcPr>
+            <w:tcW w:w="1881" w:type="dxa"/>
+          </w:tcPr>
+          <w:p>
+            <w:r>
+              <w:rPr>
+                <w:sz w:val="20"/>
+              </w:rPr>
+              <w:t xml:space="preserve">Sí</w:t>
+            </w:r>
+          </w:p>
+        </w:tc>
+      </w:tr>
+      <w:tr>
+        <w:trPr>
+          <w:jc w:val="center"/>
+        </w:trPr>
+        <w:tc>
+          <w:tcPr>
+            <w:tcW w:w="1881" w:type="dxa"/>
+          </w:tcPr>
+          <w:p>
+            <w:r>
+              <w:rPr>
+                <w:sz w:val="20"/>
+              </w:rPr>
               <w:t>Registrar mantención</w:t>
             </w:r>
           </w:p>
@@ -4027,54 +4253,46 @@
               <w:rPr>
                 <w:sz w:val="20"/>
               </w:rPr>
-              <w:t>RF-27</w:t>
-            </w:r>
-          </w:p>
-        </w:tc>
-        <w:tc>
-          <w:tcPr>
-            <w:tcW w:w="2351" w:type="dxa"/>
-          </w:tcPr>
-          <w:p>
-            <w:r>
-              <w:rPr>
-                <w:sz w:val="20"/>
-              </w:rPr>
-              <w:t xml:space="preserve">El sistema debe permitir seleccionar un periodo para el reporte de costos, generado a partir de las </w:t>
-            </w:r>
-            <w:r>
-              <w:rPr>
-                <w:sz w:val="20"/>
-              </w:rPr>
-              <w:lastRenderedPageBreak/>
-              <w:t>fechas reales de mantenciones registradas.</w:t>
-            </w:r>
-          </w:p>
-        </w:tc>
-        <w:tc>
-          <w:tcPr>
-            <w:tcW w:w="2351" w:type="dxa"/>
-          </w:tcPr>
-          <w:p>
-            <w:r>
-              <w:rPr>
-                <w:sz w:val="20"/>
-              </w:rPr>
-              <w:lastRenderedPageBreak/>
-              <w:t>Alta</w:t>
-            </w:r>
-          </w:p>
-        </w:tc>
-        <w:tc>
-          <w:tcPr>
-            <w:tcW w:w="2351" w:type="dxa"/>
-          </w:tcPr>
-          <w:p>
-            <w:r>
-              <w:rPr>
-                <w:sz w:val="20"/>
-              </w:rPr>
-              <w:t>Insp., Admin</w:t>
+              <w:t xml:space="preserve">RF-27</w:t>
+            </w:r>
+          </w:p>
+        </w:tc>
+        <w:tc>
+          <w:tcPr>
+            <w:tcW w:w="2351" w:type="dxa"/>
+          </w:tcPr>
+          <w:p>
+            <w:r>
+              <w:rPr>
+                <w:sz w:val="20"/>
+              </w:rPr>
+              <w:t xml:space="preserve">El sistema debe permitir seleccionar el periodo del reporte de costos: todo el periodo, un mes (generado a partir de las fechas reales de mantenciones) o un rango de fechas personalizado.</w:t>
+            </w:r>
+          </w:p>
+        </w:tc>
+        <w:tc>
+          <w:tcPr>
+            <w:tcW w:w="2351" w:type="dxa"/>
+          </w:tcPr>
+          <w:p>
+            <w:r>
+              <w:rPr>
+                <w:sz w:val="20"/>
+              </w:rPr>
+              <w:t xml:space="preserve">Alta</w:t>
+            </w:r>
+          </w:p>
+        </w:tc>
+        <w:tc>
+          <w:tcPr>
+            <w:tcW w:w="2351" w:type="dxa"/>
+          </w:tcPr>
+          <w:p>
+            <w:r>
+              <w:rPr>
+                <w:sz w:val="20"/>
+              </w:rPr>
+              <w:t xml:space="preserve">Insp., Admin</w:t>
             </w:r>
           </w:p>
         </w:tc>
@@ -4092,46 +4310,46 @@
               <w:rPr>
                 <w:sz w:val="20"/>
               </w:rPr>
-              <w:t>RF-28</w:t>
-            </w:r>
-          </w:p>
-        </w:tc>
-        <w:tc>
-          <w:tcPr>
-            <w:tcW w:w="2351" w:type="dxa"/>
-          </w:tcPr>
-          <w:p>
-            <w:r>
-              <w:rPr>
-                <w:sz w:val="20"/>
-              </w:rPr>
-              <w:t>El sistema debe filtrar mantenciones según el periodo seleccionado.</w:t>
-            </w:r>
-          </w:p>
-        </w:tc>
-        <w:tc>
-          <w:tcPr>
-            <w:tcW w:w="2351" w:type="dxa"/>
-          </w:tcPr>
-          <w:p>
-            <w:r>
-              <w:rPr>
-                <w:sz w:val="20"/>
-              </w:rPr>
-              <w:t>Alta</w:t>
-            </w:r>
-          </w:p>
-        </w:tc>
-        <w:tc>
-          <w:tcPr>
-            <w:tcW w:w="2351" w:type="dxa"/>
-          </w:tcPr>
-          <w:p>
-            <w:r>
-              <w:rPr>
-                <w:sz w:val="20"/>
-              </w:rPr>
-              <w:t>Insp., Admin</w:t>
+              <w:t xml:space="preserve">RF-28</w:t>
+            </w:r>
+          </w:p>
+        </w:tc>
+        <w:tc>
+          <w:tcPr>
+            <w:tcW w:w="2351" w:type="dxa"/>
+          </w:tcPr>
+          <w:p>
+            <w:r>
+              <w:rPr>
+                <w:sz w:val="20"/>
+              </w:rPr>
+              <w:t xml:space="preserve">El sistema debe filtrar mantenciones según el periodo seleccionado, considerando su fecha de ingreso.</w:t>
+            </w:r>
+          </w:p>
+        </w:tc>
+        <w:tc>
+          <w:tcPr>
+            <w:tcW w:w="2351" w:type="dxa"/>
+          </w:tcPr>
+          <w:p>
+            <w:r>
+              <w:rPr>
+                <w:sz w:val="20"/>
+              </w:rPr>
+              <w:t xml:space="preserve">Alta</w:t>
+            </w:r>
+          </w:p>
+        </w:tc>
+        <w:tc>
+          <w:tcPr>
+            <w:tcW w:w="2351" w:type="dxa"/>
+          </w:tcPr>
+          <w:p>
+            <w:r>
+              <w:rPr>
+                <w:sz w:val="20"/>
+              </w:rPr>
+              <w:t xml:space="preserve">Insp., Admin</w:t>
             </w:r>
           </w:p>
         </w:tc>
@@ -4206,46 +4424,46 @@
               <w:rPr>
                 <w:sz w:val="20"/>
               </w:rPr>
-              <w:t>RF-30</w:t>
-            </w:r>
-          </w:p>
-        </w:tc>
-        <w:tc>
-          <w:tcPr>
-            <w:tcW w:w="2351" w:type="dxa"/>
-          </w:tcPr>
-          <w:p>
-            <w:r>
-              <w:rPr>
-                <w:sz w:val="20"/>
-              </w:rPr>
-              <w:t>El archivo PDF debe identificarse con el periodo (p. ej. `reporte-costos-2026-09.pdf`).</w:t>
-            </w:r>
-          </w:p>
-        </w:tc>
-        <w:tc>
-          <w:tcPr>
-            <w:tcW w:w="2351" w:type="dxa"/>
-          </w:tcPr>
-          <w:p>
-            <w:r>
-              <w:rPr>
-                <w:sz w:val="20"/>
-              </w:rPr>
-              <w:t>Media</w:t>
-            </w:r>
-          </w:p>
-        </w:tc>
-        <w:tc>
-          <w:tcPr>
-            <w:tcW w:w="2351" w:type="dxa"/>
-          </w:tcPr>
-          <w:p>
-            <w:r>
-              <w:rPr>
-                <w:sz w:val="20"/>
-              </w:rPr>
-              <w:t>Insp., Admin</w:t>
+              <w:t xml:space="preserve">RF-30</w:t>
+            </w:r>
+          </w:p>
+        </w:tc>
+        <w:tc>
+          <w:tcPr>
+            <w:tcW w:w="2351" w:type="dxa"/>
+          </w:tcPr>
+          <w:p>
+            <w:r>
+              <w:rPr>
+                <w:sz w:val="20"/>
+              </w:rPr>
+              <w:t xml:space="preserve">El archivo PDF debe identificarse con el periodo (p. ej. `reporte-costos-2026-09.pdf` o, para un rango, `reporte-costos-2026-09-01_2026-09-30.pdf`).</w:t>
+            </w:r>
+          </w:p>
+        </w:tc>
+        <w:tc>
+          <w:tcPr>
+            <w:tcW w:w="2351" w:type="dxa"/>
+          </w:tcPr>
+          <w:p>
+            <w:r>
+              <w:rPr>
+                <w:sz w:val="20"/>
+              </w:rPr>
+              <w:t xml:space="preserve">Media</w:t>
+            </w:r>
+          </w:p>
+        </w:tc>
+        <w:tc>
+          <w:tcPr>
+            <w:tcW w:w="2351" w:type="dxa"/>
+          </w:tcPr>
+          <w:p>
+            <w:r>
+              <w:rPr>
+                <w:sz w:val="20"/>
+              </w:rPr>
+              <w:t xml:space="preserve">Insp., Admin</w:t>
             </w:r>
           </w:p>
         </w:tc>
@@ -4359,46 +4577,46 @@
               <w:rPr>
                 <w:sz w:val="20"/>
               </w:rPr>
-              <w:t>RF-31</w:t>
-            </w:r>
-          </w:p>
-        </w:tc>
-        <w:tc>
-          <w:tcPr>
-            <w:tcW w:w="2351" w:type="dxa"/>
-          </w:tcPr>
-          <w:p>
-            <w:r>
-              <w:rPr>
-                <w:sz w:val="20"/>
-              </w:rPr>
-              <w:t>El sistema debe listar las alertas/recordatorios de mantención con datos del vehículo asociado.</w:t>
-            </w:r>
-          </w:p>
-        </w:tc>
-        <w:tc>
-          <w:tcPr>
-            <w:tcW w:w="2351" w:type="dxa"/>
-          </w:tcPr>
-          <w:p>
-            <w:r>
-              <w:rPr>
-                <w:sz w:val="20"/>
-              </w:rPr>
-              <w:t>Media</w:t>
-            </w:r>
-          </w:p>
-        </w:tc>
-        <w:tc>
-          <w:tcPr>
-            <w:tcW w:w="2351" w:type="dxa"/>
-          </w:tcPr>
-          <w:p>
-            <w:r>
-              <w:rPr>
-                <w:sz w:val="20"/>
-              </w:rPr>
-              <w:t>Todos</w:t>
+              <w:t xml:space="preserve">RF-31</w:t>
+            </w:r>
+          </w:p>
+        </w:tc>
+        <w:tc>
+          <w:tcPr>
+            <w:tcW w:w="2351" w:type="dxa"/>
+          </w:tcPr>
+          <w:p>
+            <w:r>
+              <w:rPr>
+                <w:sz w:val="20"/>
+              </w:rPr>
+              <w:t xml:space="preserve">El sistema debe listar las alertas de mantención preventiva de la compañía con datos del vehículo, ordenadas de más a menos urgente (vencidas antes que próximas).</w:t>
+            </w:r>
+          </w:p>
+        </w:tc>
+        <w:tc>
+          <w:tcPr>
+            <w:tcW w:w="2351" w:type="dxa"/>
+          </w:tcPr>
+          <w:p>
+            <w:r>
+              <w:rPr>
+                <w:sz w:val="20"/>
+              </w:rPr>
+              <w:t xml:space="preserve">Media</w:t>
+            </w:r>
+          </w:p>
+        </w:tc>
+        <w:tc>
+          <w:tcPr>
+            <w:tcW w:w="2351" w:type="dxa"/>
+          </w:tcPr>
+          <w:p>
+            <w:r>
+              <w:rPr>
+                <w:sz w:val="20"/>
+              </w:rPr>
+              <w:t xml:space="preserve">Todos</w:t>
             </w:r>
           </w:p>
         </w:tc>
@@ -4416,46 +4634,46 @@
               <w:rPr>
                 <w:sz w:val="20"/>
               </w:rPr>
-              <w:t>RF-32</w:t>
-            </w:r>
-          </w:p>
-        </w:tc>
-        <w:tc>
-          <w:tcPr>
-            <w:tcW w:w="2351" w:type="dxa"/>
-          </w:tcPr>
-          <w:p>
-            <w:r>
-              <w:rPr>
-                <w:sz w:val="20"/>
-              </w:rPr>
-              <w:t>El sistema debe permitir crear alertas por fecha programada y/o kilometraje programado, asociadas a un vehículo.</w:t>
-            </w:r>
-          </w:p>
-        </w:tc>
-        <w:tc>
-          <w:tcPr>
-            <w:tcW w:w="2351" w:type="dxa"/>
-          </w:tcPr>
-          <w:p>
-            <w:r>
-              <w:rPr>
-                <w:sz w:val="20"/>
-              </w:rPr>
-              <w:t>Media</w:t>
-            </w:r>
-          </w:p>
-        </w:tc>
-        <w:tc>
-          <w:tcPr>
-            <w:tcW w:w="2351" w:type="dxa"/>
-          </w:tcPr>
-          <w:p>
-            <w:r>
-              <w:rPr>
-                <w:sz w:val="20"/>
-              </w:rPr>
-              <w:t>Ten. 3, Insp., Admin</w:t>
+              <w:t xml:space="preserve">RF-32</w:t>
+            </w:r>
+          </w:p>
+        </w:tc>
+        <w:tc>
+          <w:tcPr>
+            <w:tcW w:w="2351" w:type="dxa"/>
+          </w:tcPr>
+          <w:p>
+            <w:r>
+              <w:rPr>
+                <w:sz w:val="20"/>
+              </w:rPr>
+              <w:t xml:space="preserve">La API debe permitir crear recordatorios manuales por fecha programada y/o kilometraje programado, asociados a un vehículo (`/api/alertas`).</w:t>
+            </w:r>
+          </w:p>
+        </w:tc>
+        <w:tc>
+          <w:tcPr>
+            <w:tcW w:w="2351" w:type="dxa"/>
+          </w:tcPr>
+          <w:p>
+            <w:r>
+              <w:rPr>
+                <w:sz w:val="20"/>
+              </w:rPr>
+              <w:t xml:space="preserve">Media</w:t>
+            </w:r>
+          </w:p>
+        </w:tc>
+        <w:tc>
+          <w:tcPr>
+            <w:tcW w:w="2351" w:type="dxa"/>
+          </w:tcPr>
+          <w:p>
+            <w:r>
+              <w:rPr>
+                <w:sz w:val="20"/>
+              </w:rPr>
+              <w:t xml:space="preserve">Ten. 3, Insp., Admin</w:t>
             </w:r>
           </w:p>
         </w:tc>
@@ -4795,6 +5013,1035 @@
     </w:tbl>
     <w:p>
       <w:pPr>
+        <w:pStyle w:val="Ttulo3"/>
+      </w:pPr>
+      <w:r>
+        <w:rPr>
+          <w:rFonts w:ascii="Calibri" w:hAnsi="Calibri"/>
+          <w:color w:val="1F49A3"/>
+          <w:sz w:val="24"/>
+        </w:rPr>
+        <w:t xml:space="preserve">3.9 Reporte y derivación de fallas</w:t>
+      </w:r>
+    </w:p>
+    <w:tbl>
+      <w:tblPr>
+        <w:tblStyle w:val="Tablaconcuadrcula"/>
+        <w:tblW w:w="0" w:type="auto"/>
+        <w:jc w:val="center"/>
+        <w:tblLook w:val="04A0" w:firstRow="1" w:lastRow="0" w:firstColumn="1" w:lastColumn="0" w:noHBand="0" w:noVBand="1"/>
+      </w:tblPr>
+      <w:tblGrid>
+        <w:gridCol w:w="2351"/>
+        <w:gridCol w:w="2351"/>
+        <w:gridCol w:w="2351"/>
+        <w:gridCol w:w="2351"/>
+      </w:tblGrid>
+      <w:tr>
+        <w:trPr>
+          <w:jc w:val="center"/>
+        </w:trPr>
+        <w:tc>
+          <w:tcPr>
+            <w:tcW w:w="2351" w:type="dxa"/>
+            <w:shd w:val="clear" w:color="auto" w:fill="1F49A3"/>
+          </w:tcPr>
+          <w:p>
+            <w:r>
+              <w:rPr>
+                <w:b/>
+                <w:color w:val="FFFFFF"/>
+                <w:sz w:val="20"/>
+              </w:rPr>
+              <w:t xml:space="preserve">ID</w:t>
+            </w:r>
+          </w:p>
+        </w:tc>
+        <w:tc>
+          <w:tcPr>
+            <w:tcW w:w="2351" w:type="dxa"/>
+            <w:shd w:val="clear" w:color="auto" w:fill="1F49A3"/>
+          </w:tcPr>
+          <w:p>
+            <w:r>
+              <w:rPr>
+                <w:b/>
+                <w:color w:val="FFFFFF"/>
+                <w:sz w:val="20"/>
+              </w:rPr>
+              <w:t xml:space="preserve">Requisito</w:t>
+            </w:r>
+          </w:p>
+        </w:tc>
+        <w:tc>
+          <w:tcPr>
+            <w:tcW w:w="2351" w:type="dxa"/>
+            <w:shd w:val="clear" w:color="auto" w:fill="1F49A3"/>
+          </w:tcPr>
+          <w:p>
+            <w:r>
+              <w:rPr>
+                <w:b/>
+                <w:color w:val="FFFFFF"/>
+                <w:sz w:val="20"/>
+              </w:rPr>
+              <w:t xml:space="preserve">Prioridad</w:t>
+            </w:r>
+          </w:p>
+        </w:tc>
+        <w:tc>
+          <w:tcPr>
+            <w:tcW w:w="2351" w:type="dxa"/>
+            <w:shd w:val="clear" w:color="auto" w:fill="1F49A3"/>
+          </w:tcPr>
+          <w:p>
+            <w:r>
+              <w:rPr>
+                <w:b/>
+                <w:color w:val="FFFFFF"/>
+                <w:sz w:val="20"/>
+              </w:rPr>
+              <w:t xml:space="preserve">Rol</w:t>
+            </w:r>
+          </w:p>
+        </w:tc>
+      </w:tr>
+      <w:tr>
+        <w:trPr>
+          <w:jc w:val="center"/>
+        </w:trPr>
+        <w:tc>
+          <w:tcPr>
+            <w:tcW w:w="2351" w:type="dxa"/>
+          </w:tcPr>
+          <w:p>
+            <w:r>
+              <w:rPr>
+                <w:sz w:val="20"/>
+              </w:rPr>
+              <w:t xml:space="preserve">RF-37</w:t>
+            </w:r>
+          </w:p>
+        </w:tc>
+        <w:tc>
+          <w:tcPr>
+            <w:tcW w:w="2351" w:type="dxa"/>
+          </w:tcPr>
+          <w:p>
+            <w:r>
+              <w:rPr>
+                <w:sz w:val="20"/>
+              </w:rPr>
+              <w:t xml:space="preserve">Al registrar un reporte de falla, el vehículo debe pasar a "No operativo" en la misma operación (transacción).</w:t>
+            </w:r>
+          </w:p>
+        </w:tc>
+        <w:tc>
+          <w:tcPr>
+            <w:tcW w:w="2351" w:type="dxa"/>
+          </w:tcPr>
+          <w:p>
+            <w:r>
+              <w:rPr>
+                <w:sz w:val="20"/>
+              </w:rPr>
+              <w:t xml:space="preserve">Alta</w:t>
+            </w:r>
+          </w:p>
+        </w:tc>
+        <w:tc>
+          <w:tcPr>
+            <w:tcW w:w="2351" w:type="dxa"/>
+          </w:tcPr>
+          <w:p>
+            <w:r>
+              <w:rPr>
+                <w:sz w:val="20"/>
+              </w:rPr>
+              <w:t xml:space="preserve">Todos</w:t>
+            </w:r>
+          </w:p>
+        </w:tc>
+      </w:tr>
+      <w:tr>
+        <w:trPr>
+          <w:jc w:val="center"/>
+        </w:trPr>
+        <w:tc>
+          <w:tcPr>
+            <w:tcW w:w="2351" w:type="dxa"/>
+          </w:tcPr>
+          <w:p>
+            <w:r>
+              <w:rPr>
+                <w:sz w:val="20"/>
+              </w:rPr>
+              <w:t xml:space="preserve">RF-38</w:t>
+            </w:r>
+          </w:p>
+        </w:tc>
+        <w:tc>
+          <w:tcPr>
+            <w:tcW w:w="2351" w:type="dxa"/>
+          </w:tcPr>
+          <w:p>
+            <w:r>
+              <w:rPr>
+                <w:sz w:val="20"/>
+              </w:rPr>
+              <w:t xml:space="preserve">El Teniente Tercero debe ver los reportes pendientes de su compañía ordenados por urgencia (alta, media, baja) y, a igual urgencia, del más antiguo al más reciente.</w:t>
+            </w:r>
+          </w:p>
+        </w:tc>
+        <w:tc>
+          <w:tcPr>
+            <w:tcW w:w="2351" w:type="dxa"/>
+          </w:tcPr>
+          <w:p>
+            <w:r>
+              <w:rPr>
+                <w:sz w:val="20"/>
+              </w:rPr>
+              <w:t xml:space="preserve">Alta</w:t>
+            </w:r>
+          </w:p>
+        </w:tc>
+        <w:tc>
+          <w:tcPr>
+            <w:tcW w:w="2351" w:type="dxa"/>
+          </w:tcPr>
+          <w:p>
+            <w:r>
+              <w:rPr>
+                <w:sz w:val="20"/>
+              </w:rPr>
+              <w:t xml:space="preserve">Ten. 3, Insp., Admin</w:t>
+            </w:r>
+          </w:p>
+        </w:tc>
+      </w:tr>
+      <w:tr>
+        <w:trPr>
+          <w:jc w:val="center"/>
+        </w:trPr>
+        <w:tc>
+          <w:tcPr>
+            <w:tcW w:w="2351" w:type="dxa"/>
+          </w:tcPr>
+          <w:p>
+            <w:r>
+              <w:rPr>
+                <w:sz w:val="20"/>
+              </w:rPr>
+              <w:t xml:space="preserve">RF-39</w:t>
+            </w:r>
+          </w:p>
+        </w:tc>
+        <w:tc>
+          <w:tcPr>
+            <w:tcW w:w="2351" w:type="dxa"/>
+          </w:tcPr>
+          <w:p>
+            <w:r>
+              <w:rPr>
+                <w:sz w:val="20"/>
+              </w:rPr>
+              <w:t xml:space="preserve">El sistema debe permitir derivar un reporte pendiente al Inspector de Material Mayor (estado "derivado"), registrando quién lo derivó y cuándo.</w:t>
+            </w:r>
+          </w:p>
+        </w:tc>
+        <w:tc>
+          <w:tcPr>
+            <w:tcW w:w="2351" w:type="dxa"/>
+          </w:tcPr>
+          <w:p>
+            <w:r>
+              <w:rPr>
+                <w:sz w:val="20"/>
+              </w:rPr>
+              <w:t xml:space="preserve">Alta</w:t>
+            </w:r>
+          </w:p>
+        </w:tc>
+        <w:tc>
+          <w:tcPr>
+            <w:tcW w:w="2351" w:type="dxa"/>
+          </w:tcPr>
+          <w:p>
+            <w:r>
+              <w:rPr>
+                <w:sz w:val="20"/>
+              </w:rPr>
+              <w:t xml:space="preserve">Ten. 3, Insp., Admin</w:t>
+            </w:r>
+          </w:p>
+        </w:tc>
+      </w:tr>
+      <w:tr>
+        <w:trPr>
+          <w:jc w:val="center"/>
+        </w:trPr>
+        <w:tc>
+          <w:tcPr>
+            <w:tcW w:w="2351" w:type="dxa"/>
+          </w:tcPr>
+          <w:p>
+            <w:r>
+              <w:rPr>
+                <w:sz w:val="20"/>
+              </w:rPr>
+              <w:t xml:space="preserve">RF-40</w:t>
+            </w:r>
+          </w:p>
+        </w:tc>
+        <w:tc>
+          <w:tcPr>
+            <w:tcW w:w="2351" w:type="dxa"/>
+          </w:tcPr>
+          <w:p>
+            <w:r>
+              <w:rPr>
+                <w:sz w:val="20"/>
+              </w:rPr>
+              <w:t xml:space="preserve">La pestaña "Fallas" debe mostrar un contador de reportes por atender: pendientes para el Teniente Tercero, derivados sin mantención para el Inspector y ambos para el Administrador.</w:t>
+            </w:r>
+          </w:p>
+        </w:tc>
+        <w:tc>
+          <w:tcPr>
+            <w:tcW w:w="2351" w:type="dxa"/>
+          </w:tcPr>
+          <w:p>
+            <w:r>
+              <w:rPr>
+                <w:sz w:val="20"/>
+              </w:rPr>
+              <w:t xml:space="preserve">Media</w:t>
+            </w:r>
+          </w:p>
+        </w:tc>
+        <w:tc>
+          <w:tcPr>
+            <w:tcW w:w="2351" w:type="dxa"/>
+          </w:tcPr>
+          <w:p>
+            <w:r>
+              <w:rPr>
+                <w:sz w:val="20"/>
+              </w:rPr>
+              <w:t xml:space="preserve">Ten. 3, Insp., Admin</w:t>
+            </w:r>
+          </w:p>
+        </w:tc>
+      </w:tr>
+      <w:tr>
+        <w:trPr>
+          <w:jc w:val="center"/>
+        </w:trPr>
+        <w:tc>
+          <w:tcPr>
+            <w:tcW w:w="2351" w:type="dxa"/>
+          </w:tcPr>
+          <w:p>
+            <w:r>
+              <w:rPr>
+                <w:sz w:val="20"/>
+              </w:rPr>
+              <w:t xml:space="preserve">RF-41</w:t>
+            </w:r>
+          </w:p>
+        </w:tc>
+        <w:tc>
+          <w:tcPr>
+            <w:tcW w:w="2351" w:type="dxa"/>
+          </w:tcPr>
+          <w:p>
+            <w:r>
+              <w:rPr>
+                <w:sz w:val="20"/>
+              </w:rPr>
+              <w:t xml:space="preserve">La ficha del vehículo debe mostrar el historial de fallas con fecha, urgencia, estado, descripción, quién lo reportó y quién lo derivó.</w:t>
+            </w:r>
+          </w:p>
+        </w:tc>
+        <w:tc>
+          <w:tcPr>
+            <w:tcW w:w="2351" w:type="dxa"/>
+          </w:tcPr>
+          <w:p>
+            <w:r>
+              <w:rPr>
+                <w:sz w:val="20"/>
+              </w:rPr>
+              <w:t xml:space="preserve">Media</w:t>
+            </w:r>
+          </w:p>
+        </w:tc>
+        <w:tc>
+          <w:tcPr>
+            <w:tcW w:w="2351" w:type="dxa"/>
+          </w:tcPr>
+          <w:p>
+            <w:r>
+              <w:rPr>
+                <w:sz w:val="20"/>
+              </w:rPr>
+              <w:t xml:space="preserve">Todos</w:t>
+            </w:r>
+          </w:p>
+        </w:tc>
+      </w:tr>
+    </w:tbl>
+    <w:p>
+      <w:pPr>
+        <w:pStyle w:val="Ttulo3"/>
+      </w:pPr>
+      <w:r>
+        <w:rPr>
+          <w:rFonts w:ascii="Calibri" w:hAnsi="Calibri"/>
+          <w:color w:val="1F49A3"/>
+          <w:sz w:val="24"/>
+        </w:rPr>
+        <w:t xml:space="preserve">3.10 Mantención preventiva y estado del vehículo</w:t>
+      </w:r>
+    </w:p>
+    <w:tbl>
+      <w:tblPr>
+        <w:tblStyle w:val="Tablaconcuadrcula"/>
+        <w:tblW w:w="0" w:type="auto"/>
+        <w:jc w:val="center"/>
+        <w:tblLook w:val="04A0" w:firstRow="1" w:lastRow="0" w:firstColumn="1" w:lastColumn="0" w:noHBand="0" w:noVBand="1"/>
+      </w:tblPr>
+      <w:tblGrid>
+        <w:gridCol w:w="2351"/>
+        <w:gridCol w:w="2351"/>
+        <w:gridCol w:w="2351"/>
+        <w:gridCol w:w="2351"/>
+      </w:tblGrid>
+      <w:tr>
+        <w:trPr>
+          <w:jc w:val="center"/>
+        </w:trPr>
+        <w:tc>
+          <w:tcPr>
+            <w:tcW w:w="2351" w:type="dxa"/>
+            <w:shd w:val="clear" w:color="auto" w:fill="1F49A3"/>
+          </w:tcPr>
+          <w:p>
+            <w:r>
+              <w:rPr>
+                <w:b/>
+                <w:color w:val="FFFFFF"/>
+                <w:sz w:val="20"/>
+              </w:rPr>
+              <w:t xml:space="preserve">ID</w:t>
+            </w:r>
+          </w:p>
+        </w:tc>
+        <w:tc>
+          <w:tcPr>
+            <w:tcW w:w="2351" w:type="dxa"/>
+            <w:shd w:val="clear" w:color="auto" w:fill="1F49A3"/>
+          </w:tcPr>
+          <w:p>
+            <w:r>
+              <w:rPr>
+                <w:b/>
+                <w:color w:val="FFFFFF"/>
+                <w:sz w:val="20"/>
+              </w:rPr>
+              <w:t xml:space="preserve">Requisito</w:t>
+            </w:r>
+          </w:p>
+        </w:tc>
+        <w:tc>
+          <w:tcPr>
+            <w:tcW w:w="2351" w:type="dxa"/>
+            <w:shd w:val="clear" w:color="auto" w:fill="1F49A3"/>
+          </w:tcPr>
+          <w:p>
+            <w:r>
+              <w:rPr>
+                <w:b/>
+                <w:color w:val="FFFFFF"/>
+                <w:sz w:val="20"/>
+              </w:rPr>
+              <w:t xml:space="preserve">Prioridad</w:t>
+            </w:r>
+          </w:p>
+        </w:tc>
+        <w:tc>
+          <w:tcPr>
+            <w:tcW w:w="2351" w:type="dxa"/>
+            <w:shd w:val="clear" w:color="auto" w:fill="1F49A3"/>
+          </w:tcPr>
+          <w:p>
+            <w:r>
+              <w:rPr>
+                <w:b/>
+                <w:color w:val="FFFFFF"/>
+                <w:sz w:val="20"/>
+              </w:rPr>
+              <w:t xml:space="preserve">Rol</w:t>
+            </w:r>
+          </w:p>
+        </w:tc>
+      </w:tr>
+      <w:tr>
+        <w:trPr>
+          <w:jc w:val="center"/>
+        </w:trPr>
+        <w:tc>
+          <w:tcPr>
+            <w:tcW w:w="2351" w:type="dxa"/>
+          </w:tcPr>
+          <w:p>
+            <w:r>
+              <w:rPr>
+                <w:sz w:val="20"/>
+              </w:rPr>
+              <w:t xml:space="preserve">RF-42</w:t>
+            </w:r>
+          </w:p>
+        </w:tc>
+        <w:tc>
+          <w:tcPr>
+            <w:tcW w:w="2351" w:type="dxa"/>
+          </w:tcPr>
+          <w:p>
+            <w:r>
+              <w:rPr>
+                <w:sz w:val="20"/>
+              </w:rPr>
+              <w:t xml:space="preserve">El sistema debe calcular la próxima mantención preventiva de cada vehículo sumando 6 meses a la fecha de salida de su última mantención preventiva finalizada.</w:t>
+            </w:r>
+          </w:p>
+        </w:tc>
+        <w:tc>
+          <w:tcPr>
+            <w:tcW w:w="2351" w:type="dxa"/>
+          </w:tcPr>
+          <w:p>
+            <w:r>
+              <w:rPr>
+                <w:sz w:val="20"/>
+              </w:rPr>
+              <w:t xml:space="preserve">Alta</w:t>
+            </w:r>
+          </w:p>
+        </w:tc>
+        <w:tc>
+          <w:tcPr>
+            <w:tcW w:w="2351" w:type="dxa"/>
+          </w:tcPr>
+          <w:p>
+            <w:r>
+              <w:rPr>
+                <w:sz w:val="20"/>
+              </w:rPr>
+              <w:t xml:space="preserve">—</w:t>
+            </w:r>
+          </w:p>
+        </w:tc>
+      </w:tr>
+      <w:tr>
+        <w:trPr>
+          <w:jc w:val="center"/>
+        </w:trPr>
+        <w:tc>
+          <w:tcPr>
+            <w:tcW w:w="2351" w:type="dxa"/>
+          </w:tcPr>
+          <w:p>
+            <w:r>
+              <w:rPr>
+                <w:sz w:val="20"/>
+              </w:rPr>
+              <w:t xml:space="preserve">RF-43</w:t>
+            </w:r>
+          </w:p>
+        </w:tc>
+        <w:tc>
+          <w:tcPr>
+            <w:tcW w:w="2351" w:type="dxa"/>
+          </w:tcPr>
+          <w:p>
+            <w:r>
+              <w:rPr>
+                <w:sz w:val="20"/>
+              </w:rPr>
+              <w:t xml:space="preserve">La preventiva debe quedar "próxima" desde 30 días antes del vencimiento, "vencida" una vez cumplido el plazo y "sin registro" si el vehículo no tiene preventivas. Solo se considera el tiempo, no el kilometraje.</w:t>
+            </w:r>
+          </w:p>
+        </w:tc>
+        <w:tc>
+          <w:tcPr>
+            <w:tcW w:w="2351" w:type="dxa"/>
+          </w:tcPr>
+          <w:p>
+            <w:r>
+              <w:rPr>
+                <w:sz w:val="20"/>
+              </w:rPr>
+              <w:t xml:space="preserve">Alta</w:t>
+            </w:r>
+          </w:p>
+        </w:tc>
+        <w:tc>
+          <w:tcPr>
+            <w:tcW w:w="2351" w:type="dxa"/>
+          </w:tcPr>
+          <w:p>
+            <w:r>
+              <w:rPr>
+                <w:sz w:val="20"/>
+              </w:rPr>
+              <w:t xml:space="preserve">—</w:t>
+            </w:r>
+          </w:p>
+        </w:tc>
+      </w:tr>
+      <w:tr>
+        <w:trPr>
+          <w:jc w:val="center"/>
+        </w:trPr>
+        <w:tc>
+          <w:tcPr>
+            <w:tcW w:w="2351" w:type="dxa"/>
+          </w:tcPr>
+          <w:p>
+            <w:r>
+              <w:rPr>
+                <w:sz w:val="20"/>
+              </w:rPr>
+              <w:t xml:space="preserve">RF-44</w:t>
+            </w:r>
+          </w:p>
+        </w:tc>
+        <w:tc>
+          <w:tcPr>
+            <w:tcW w:w="2351" w:type="dxa"/>
+          </w:tcPr>
+          <w:p>
+            <w:r>
+              <w:rPr>
+                <w:sz w:val="20"/>
+              </w:rPr>
+              <w:t xml:space="preserve">El estado del vehículo debe calcularse automáticamente: "En mantención" si tiene una mantención en proceso; si no, "No operativo" si tiene reportes pendientes o derivados; en otro caso, "Operativo".</w:t>
+            </w:r>
+          </w:p>
+        </w:tc>
+        <w:tc>
+          <w:tcPr>
+            <w:tcW w:w="2351" w:type="dxa"/>
+          </w:tcPr>
+          <w:p>
+            <w:r>
+              <w:rPr>
+                <w:sz w:val="20"/>
+              </w:rPr>
+              <w:t xml:space="preserve">Alta</w:t>
+            </w:r>
+          </w:p>
+        </w:tc>
+        <w:tc>
+          <w:tcPr>
+            <w:tcW w:w="2351" w:type="dxa"/>
+          </w:tcPr>
+          <w:p>
+            <w:r>
+              <w:rPr>
+                <w:sz w:val="20"/>
+              </w:rPr>
+              <w:t xml:space="preserve">—</w:t>
+            </w:r>
+          </w:p>
+        </w:tc>
+      </w:tr>
+      <w:tr>
+        <w:trPr>
+          <w:jc w:val="center"/>
+        </w:trPr>
+        <w:tc>
+          <w:tcPr>
+            <w:tcW w:w="2351" w:type="dxa"/>
+          </w:tcPr>
+          <w:p>
+            <w:r>
+              <w:rPr>
+                <w:sz w:val="20"/>
+              </w:rPr>
+              <w:t xml:space="preserve">RF-45</w:t>
+            </w:r>
+          </w:p>
+        </w:tc>
+        <w:tc>
+          <w:tcPr>
+            <w:tcW w:w="2351" w:type="dxa"/>
+          </w:tcPr>
+          <w:p>
+            <w:r>
+              <w:rPr>
+                <w:sz w:val="20"/>
+              </w:rPr>
+              <w:t xml:space="preserve">Al finalizar una mantención reactiva asociada a un reporte derivado, el reporte debe pasar a "resuelto" y el estado del vehículo debe recalcularse.</w:t>
+            </w:r>
+          </w:p>
+        </w:tc>
+        <w:tc>
+          <w:tcPr>
+            <w:tcW w:w="2351" w:type="dxa"/>
+          </w:tcPr>
+          <w:p>
+            <w:r>
+              <w:rPr>
+                <w:sz w:val="20"/>
+              </w:rPr>
+              <w:t xml:space="preserve">Alta</w:t>
+            </w:r>
+          </w:p>
+        </w:tc>
+        <w:tc>
+          <w:tcPr>
+            <w:tcW w:w="2351" w:type="dxa"/>
+          </w:tcPr>
+          <w:p>
+            <w:r>
+              <w:rPr>
+                <w:sz w:val="20"/>
+              </w:rPr>
+              <w:t xml:space="preserve">Ten. 3, Insp., Admin</w:t>
+            </w:r>
+          </w:p>
+        </w:tc>
+      </w:tr>
+      <w:tr>
+        <w:trPr>
+          <w:jc w:val="center"/>
+        </w:trPr>
+        <w:tc>
+          <w:tcPr>
+            <w:tcW w:w="2351" w:type="dxa"/>
+          </w:tcPr>
+          <w:p>
+            <w:r>
+              <w:rPr>
+                <w:sz w:val="20"/>
+              </w:rPr>
+              <w:t xml:space="preserve">RF-46</w:t>
+            </w:r>
+          </w:p>
+        </w:tc>
+        <w:tc>
+          <w:tcPr>
+            <w:tcW w:w="2351" w:type="dxa"/>
+          </w:tcPr>
+          <w:p>
+            <w:r>
+              <w:rPr>
+                <w:sz w:val="20"/>
+              </w:rPr>
+              <w:t xml:space="preserve">El sistema debe permitir finalizar una mantención en proceso registrando su fecha de salida (`PATCH /api/mantenimientos/:id/finalizar`).</w:t>
+            </w:r>
+          </w:p>
+        </w:tc>
+        <w:tc>
+          <w:tcPr>
+            <w:tcW w:w="2351" w:type="dxa"/>
+          </w:tcPr>
+          <w:p>
+            <w:r>
+              <w:rPr>
+                <w:sz w:val="20"/>
+              </w:rPr>
+              <w:t xml:space="preserve">Media</w:t>
+            </w:r>
+          </w:p>
+        </w:tc>
+        <w:tc>
+          <w:tcPr>
+            <w:tcW w:w="2351" w:type="dxa"/>
+          </w:tcPr>
+          <w:p>
+            <w:r>
+              <w:rPr>
+                <w:sz w:val="20"/>
+              </w:rPr>
+              <w:t xml:space="preserve">Ten. 3, Insp., Admin</w:t>
+            </w:r>
+          </w:p>
+        </w:tc>
+      </w:tr>
+    </w:tbl>
+    <w:p>
+      <w:pPr>
+        <w:pStyle w:val="Ttulo3"/>
+      </w:pPr>
+      <w:r>
+        <w:rPr>
+          <w:rFonts w:ascii="Calibri" w:hAnsi="Calibri"/>
+          <w:color w:val="1F49A3"/>
+          <w:sz w:val="24"/>
+        </w:rPr>
+        <w:t xml:space="preserve">3.11 Compañías y dashboard</w:t>
+      </w:r>
+    </w:p>
+    <w:tbl>
+      <w:tblPr>
+        <w:tblStyle w:val="Tablaconcuadrcula"/>
+        <w:tblW w:w="0" w:type="auto"/>
+        <w:jc w:val="center"/>
+        <w:tblLook w:val="04A0" w:firstRow="1" w:lastRow="0" w:firstColumn="1" w:lastColumn="0" w:noHBand="0" w:noVBand="1"/>
+      </w:tblPr>
+      <w:tblGrid>
+        <w:gridCol w:w="2351"/>
+        <w:gridCol w:w="2351"/>
+        <w:gridCol w:w="2351"/>
+        <w:gridCol w:w="2351"/>
+      </w:tblGrid>
+      <w:tr>
+        <w:trPr>
+          <w:jc w:val="center"/>
+        </w:trPr>
+        <w:tc>
+          <w:tcPr>
+            <w:tcW w:w="2351" w:type="dxa"/>
+            <w:shd w:val="clear" w:color="auto" w:fill="1F49A3"/>
+          </w:tcPr>
+          <w:p>
+            <w:r>
+              <w:rPr>
+                <w:b/>
+                <w:color w:val="FFFFFF"/>
+                <w:sz w:val="20"/>
+              </w:rPr>
+              <w:t xml:space="preserve">ID</w:t>
+            </w:r>
+          </w:p>
+        </w:tc>
+        <w:tc>
+          <w:tcPr>
+            <w:tcW w:w="2351" w:type="dxa"/>
+            <w:shd w:val="clear" w:color="auto" w:fill="1F49A3"/>
+          </w:tcPr>
+          <w:p>
+            <w:r>
+              <w:rPr>
+                <w:b/>
+                <w:color w:val="FFFFFF"/>
+                <w:sz w:val="20"/>
+              </w:rPr>
+              <w:t xml:space="preserve">Requisito</w:t>
+            </w:r>
+          </w:p>
+        </w:tc>
+        <w:tc>
+          <w:tcPr>
+            <w:tcW w:w="2351" w:type="dxa"/>
+            <w:shd w:val="clear" w:color="auto" w:fill="1F49A3"/>
+          </w:tcPr>
+          <w:p>
+            <w:r>
+              <w:rPr>
+                <w:b/>
+                <w:color w:val="FFFFFF"/>
+                <w:sz w:val="20"/>
+              </w:rPr>
+              <w:t xml:space="preserve">Prioridad</w:t>
+            </w:r>
+          </w:p>
+        </w:tc>
+        <w:tc>
+          <w:tcPr>
+            <w:tcW w:w="2351" w:type="dxa"/>
+            <w:shd w:val="clear" w:color="auto" w:fill="1F49A3"/>
+          </w:tcPr>
+          <w:p>
+            <w:r>
+              <w:rPr>
+                <w:b/>
+                <w:color w:val="FFFFFF"/>
+                <w:sz w:val="20"/>
+              </w:rPr>
+              <w:t xml:space="preserve">Rol</w:t>
+            </w:r>
+          </w:p>
+        </w:tc>
+      </w:tr>
+      <w:tr>
+        <w:trPr>
+          <w:jc w:val="center"/>
+        </w:trPr>
+        <w:tc>
+          <w:tcPr>
+            <w:tcW w:w="2351" w:type="dxa"/>
+          </w:tcPr>
+          <w:p>
+            <w:r>
+              <w:rPr>
+                <w:sz w:val="20"/>
+              </w:rPr>
+              <w:t xml:space="preserve">RF-47</w:t>
+            </w:r>
+          </w:p>
+        </w:tc>
+        <w:tc>
+          <w:tcPr>
+            <w:tcW w:w="2351" w:type="dxa"/>
+          </w:tcPr>
+          <w:p>
+            <w:r>
+              <w:rPr>
+                <w:sz w:val="20"/>
+              </w:rPr>
+              <w:t xml:space="preserve">Cada usuario debe ver y operar solo los datos de su compañía (vehículos, mantenciones, fallas y alertas); la API responde 404 ante recursos de otra compañía.</w:t>
+            </w:r>
+          </w:p>
+        </w:tc>
+        <w:tc>
+          <w:tcPr>
+            <w:tcW w:w="2351" w:type="dxa"/>
+          </w:tcPr>
+          <w:p>
+            <w:r>
+              <w:rPr>
+                <w:sz w:val="20"/>
+              </w:rPr>
+              <w:t xml:space="preserve">Alta</w:t>
+            </w:r>
+          </w:p>
+        </w:tc>
+        <w:tc>
+          <w:tcPr>
+            <w:tcW w:w="2351" w:type="dxa"/>
+          </w:tcPr>
+          <w:p>
+            <w:r>
+              <w:rPr>
+                <w:sz w:val="20"/>
+              </w:rPr>
+              <w:t xml:space="preserve">Todos</w:t>
+            </w:r>
+          </w:p>
+        </w:tc>
+      </w:tr>
+      <w:tr>
+        <w:trPr>
+          <w:jc w:val="center"/>
+        </w:trPr>
+        <w:tc>
+          <w:tcPr>
+            <w:tcW w:w="2351" w:type="dxa"/>
+          </w:tcPr>
+          <w:p>
+            <w:r>
+              <w:rPr>
+                <w:sz w:val="20"/>
+              </w:rPr>
+              <w:t xml:space="preserve">RF-48</w:t>
+            </w:r>
+          </w:p>
+        </w:tc>
+        <w:tc>
+          <w:tcPr>
+            <w:tcW w:w="2351" w:type="dxa"/>
+          </w:tcPr>
+          <w:p>
+            <w:r>
+              <w:rPr>
+                <w:sz w:val="20"/>
+              </w:rPr>
+              <w:t xml:space="preserve">El administrador debe ver todas las compañías y poder filtrar la información con un selector de compañía.</w:t>
+            </w:r>
+          </w:p>
+        </w:tc>
+        <w:tc>
+          <w:tcPr>
+            <w:tcW w:w="2351" w:type="dxa"/>
+          </w:tcPr>
+          <w:p>
+            <w:r>
+              <w:rPr>
+                <w:sz w:val="20"/>
+              </w:rPr>
+              <w:t xml:space="preserve">Alta</w:t>
+            </w:r>
+          </w:p>
+        </w:tc>
+        <w:tc>
+          <w:tcPr>
+            <w:tcW w:w="2351" w:type="dxa"/>
+          </w:tcPr>
+          <w:p>
+            <w:r>
+              <w:rPr>
+                <w:sz w:val="20"/>
+              </w:rPr>
+              <w:t xml:space="preserve">Admin</w:t>
+            </w:r>
+          </w:p>
+        </w:tc>
+      </w:tr>
+      <w:tr>
+        <w:trPr>
+          <w:jc w:val="center"/>
+        </w:trPr>
+        <w:tc>
+          <w:tcPr>
+            <w:tcW w:w="2351" w:type="dxa"/>
+          </w:tcPr>
+          <w:p>
+            <w:r>
+              <w:rPr>
+                <w:sz w:val="20"/>
+              </w:rPr>
+              <w:t xml:space="preserve">RF-49</w:t>
+            </w:r>
+          </w:p>
+        </w:tc>
+        <w:tc>
+          <w:tcPr>
+            <w:tcW w:w="2351" w:type="dxa"/>
+          </w:tcPr>
+          <w:p>
+            <w:r>
+              <w:rPr>
+                <w:sz w:val="20"/>
+              </w:rPr>
+              <w:t xml:space="preserve">El dashboard debe mostrar la cantidad de vehículos operativos, en mantención y no operativos, y de mantenciones preventivas próximas y vencidas, según la compañía visible.</w:t>
+            </w:r>
+          </w:p>
+        </w:tc>
+        <w:tc>
+          <w:tcPr>
+            <w:tcW w:w="2351" w:type="dxa"/>
+          </w:tcPr>
+          <w:p>
+            <w:r>
+              <w:rPr>
+                <w:sz w:val="20"/>
+              </w:rPr>
+              <w:t xml:space="preserve">Alta</w:t>
+            </w:r>
+          </w:p>
+        </w:tc>
+        <w:tc>
+          <w:tcPr>
+            <w:tcW w:w="2351" w:type="dxa"/>
+          </w:tcPr>
+          <w:p>
+            <w:r>
+              <w:rPr>
+                <w:sz w:val="20"/>
+              </w:rPr>
+              <w:t xml:space="preserve">Todos</w:t>
+            </w:r>
+          </w:p>
+        </w:tc>
+      </w:tr>
+    </w:tbl>
+    <w:p>
+      <w:pPr>
         <w:pStyle w:val="Ttulo2"/>
       </w:pPr>
       <w:r>
@@ -4884,7 +6131,7 @@
               <w:rPr>
                 <w:sz w:val="20"/>
               </w:rPr>
-              <w:t>RNF-01</w:t>
+              <w:t xml:space="preserve">RNF-01</w:t>
             </w:r>
           </w:p>
         </w:tc>
@@ -4897,7 +6144,7 @@
               <w:rPr>
                 <w:sz w:val="20"/>
               </w:rPr>
-              <w:t>Seguridad</w:t>
+              <w:t xml:space="preserve">Seguridad</w:t>
             </w:r>
           </w:p>
         </w:tc>
@@ -4910,7 +6157,7 @@
               <w:rPr>
                 <w:sz w:val="20"/>
               </w:rPr>
-              <w:t>Las contraseñas deben almacenarse cifradas (bcrypt). El backend nunca debe devolver la contraseña en sus respuestas.</w:t>
+              <w:t xml:space="preserve">Las contraseñas deben almacenarse cifradas (bcrypt) y la base de datos rechaza cualquier valor que no sea un hash bcrypt. El backend nunca debe devolver la contraseña en sus respuestas.</w:t>
             </w:r>
           </w:p>
         </w:tc>
@@ -4928,7 +6175,7 @@
               <w:rPr>
                 <w:sz w:val="20"/>
               </w:rPr>
-              <w:t>RNF-02</w:t>
+              <w:t xml:space="preserve">RNF-02</w:t>
             </w:r>
           </w:p>
         </w:tc>
@@ -4941,7 +6188,7 @@
               <w:rPr>
                 <w:sz w:val="20"/>
               </w:rPr>
-              <w:t>Seguridad</w:t>
+              <w:t xml:space="preserve">Seguridad</w:t>
             </w:r>
           </w:p>
         </w:tc>
@@ -4954,7 +6201,7 @@
               <w:rPr>
                 <w:sz w:val="20"/>
               </w:rPr>
-              <w:t>Las credenciales de la base de datos deben mantenerse fuera del repositorio (archivo `.env`, incluido en `.gitignore`). Solo la plantilla `.env.example` se versiona.</w:t>
+              <w:t xml:space="preserve">Las credenciales de la base de datos y el secreto de sesión (`JWT_SECRET`) deben mantenerse fuera del repositorio (archivo `.env`, incluido en `.gitignore`). Solo la plantilla `.env.example` se versiona.</w:t>
             </w:r>
           </w:p>
         </w:tc>
@@ -4972,7 +6219,7 @@
               <w:rPr>
                 <w:sz w:val="20"/>
               </w:rPr>
-              <w:t>RNF-03</w:t>
+              <w:t xml:space="preserve">RNF-03</w:t>
             </w:r>
           </w:p>
         </w:tc>
@@ -4985,7 +6232,7 @@
               <w:rPr>
                 <w:sz w:val="20"/>
               </w:rPr>
-              <w:t>Seguridad</w:t>
+              <w:t xml:space="preserve">Seguridad</w:t>
             </w:r>
           </w:p>
         </w:tc>
@@ -4998,7 +6245,7 @@
               <w:rPr>
                 <w:sz w:val="20"/>
               </w:rPr>
-              <w:t>El backend debe validar los datos de entrada y responder con códigos HTTP correctos (400 para solicitudes inválidas, 404 para recursos inexistentes, 500 para errores internos).</w:t>
+              <w:t xml:space="preserve">El backend debe validar los datos de entrada y responder con códigos HTTP correctos (400 para solicitudes inválidas, 401 sin sesión, 403 sin permisos, 404 para recursos inexistentes o de otra compañía, 409 para datos duplicados, 500 para errores internos).</w:t>
             </w:r>
           </w:p>
         </w:tc>
@@ -5060,7 +6307,7 @@
               <w:rPr>
                 <w:sz w:val="20"/>
               </w:rPr>
-              <w:t>RNF-05</w:t>
+              <w:t xml:space="preserve">RNF-05</w:t>
             </w:r>
           </w:p>
         </w:tc>
@@ -5073,7 +6320,7 @@
               <w:rPr>
                 <w:sz w:val="20"/>
               </w:rPr>
-              <w:t>Disponibilidad</w:t>
+              <w:t xml:space="preserve">Disponibilidad</w:t>
             </w:r>
           </w:p>
         </w:tc>
@@ -5086,7 +6333,7 @@
               <w:rPr>
                 <w:sz w:val="20"/>
               </w:rPr>
-              <w:t>El entorno debe levantarse de forma reproducible con `docker compose` (base de datos, API y frontend).</w:t>
+              <w:t xml:space="preserve">El entorno debe levantarse de forma reproducible: la base de datos con Supabase CLI (`npx supabase start`) y la API y el frontend con `docker compose` o `npm run dev`.</w:t>
             </w:r>
           </w:p>
         </w:tc>
@@ -5104,7 +6351,7 @@
               <w:rPr>
                 <w:sz w:val="20"/>
               </w:rPr>
-              <w:t>RNF-06</w:t>
+              <w:t xml:space="preserve">RNF-06</w:t>
             </w:r>
           </w:p>
         </w:tc>
@@ -5117,7 +6364,7 @@
               <w:rPr>
                 <w:sz w:val="20"/>
               </w:rPr>
-              <w:t>Escalabilidad</w:t>
+              <w:t xml:space="preserve">Seguridad</w:t>
             </w:r>
           </w:p>
         </w:tc>
@@ -5130,7 +6377,7 @@
               <w:rPr>
                 <w:sz w:val="20"/>
               </w:rPr>
-              <w:t>Un error 500 no debe exponer detalles internos: la API responde "Error interno del servidor".</w:t>
+              <w:t xml:space="preserve">Un error 500 no debe exponer detalles internos: la API responde "Error interno del servidor".</w:t>
             </w:r>
           </w:p>
         </w:tc>
@@ -5236,7 +6483,7 @@
               <w:rPr>
                 <w:sz w:val="20"/>
               </w:rPr>
-              <w:t>RNF-09</w:t>
+              <w:t xml:space="preserve">RNF-09</w:t>
             </w:r>
           </w:p>
         </w:tc>
@@ -5249,7 +6496,7 @@
               <w:rPr>
                 <w:sz w:val="20"/>
               </w:rPr>
-              <w:t>Mantenibilidad</w:t>
+              <w:t xml:space="preserve">Mantenibilidad</w:t>
             </w:r>
           </w:p>
         </w:tc>
@@ -5262,14 +6509,7 @@
               <w:rPr>
                 <w:sz w:val="20"/>
               </w:rPr>
-              <w:t xml:space="preserve">El código debe estar organizado por módulos (rutas por dominio en `backend/src/routes`, páginas y componentes en `src/`), y el modelo de datos debe ser </w:t>
-            </w:r>
-            <w:r>
-              <w:rPr>
-                <w:sz w:val="20"/>
-              </w:rPr>
-              <w:lastRenderedPageBreak/>
-              <w:t>idempotente (`IF NOT EXISTS`).</w:t>
+              <w:t xml:space="preserve">El código debe estar organizado por módulos (rutas por dominio en `Backend/src/routes`, páginas y componentes en `Front/src/`), y el modelo de datos debe evolucionar mediante migraciones versionadas de Supabase, sin editar migraciones ya aplicadas.</w:t>
             </w:r>
           </w:p>
         </w:tc>
@@ -5315,6 +6555,138 @@
                 <w:sz w:val="20"/>
               </w:rPr>
               <w:t>La base de datos debe imponer integridad referencial e índices para evitar datos huérfanos y acelerar las consultas.</w:t>
+            </w:r>
+          </w:p>
+        </w:tc>
+      </w:tr>
+      <w:tr>
+        <w:trPr>
+          <w:jc w:val="center"/>
+        </w:trPr>
+        <w:tc>
+          <w:tcPr>
+            <w:tcW w:w="3135" w:type="dxa"/>
+          </w:tcPr>
+          <w:p>
+            <w:r>
+              <w:rPr>
+                <w:sz w:val="20"/>
+              </w:rPr>
+              <w:t xml:space="preserve">RNF-11</w:t>
+            </w:r>
+          </w:p>
+        </w:tc>
+        <w:tc>
+          <w:tcPr>
+            <w:tcW w:w="3135" w:type="dxa"/>
+          </w:tcPr>
+          <w:p>
+            <w:r>
+              <w:rPr>
+                <w:sz w:val="20"/>
+              </w:rPr>
+              <w:t xml:space="preserve">Seguridad</w:t>
+            </w:r>
+          </w:p>
+        </w:tc>
+        <w:tc>
+          <w:tcPr>
+            <w:tcW w:w="3135" w:type="dxa"/>
+          </w:tcPr>
+          <w:p>
+            <w:r>
+              <w:rPr>
+                <w:sz w:val="20"/>
+              </w:rPr>
+              <w:t xml:space="preserve">La sesión debe manejarse con un JWT firmado en una cookie `httpOnly` y `SameSite=Strict` (inaccesible desde JavaScript), con expiración de 8 horas.</w:t>
+            </w:r>
+          </w:p>
+        </w:tc>
+      </w:tr>
+      <w:tr>
+        <w:trPr>
+          <w:jc w:val="center"/>
+        </w:trPr>
+        <w:tc>
+          <w:tcPr>
+            <w:tcW w:w="3135" w:type="dxa"/>
+          </w:tcPr>
+          <w:p>
+            <w:r>
+              <w:rPr>
+                <w:sz w:val="20"/>
+              </w:rPr>
+              <w:t xml:space="preserve">RNF-12</w:t>
+            </w:r>
+          </w:p>
+        </w:tc>
+        <w:tc>
+          <w:tcPr>
+            <w:tcW w:w="3135" w:type="dxa"/>
+          </w:tcPr>
+          <w:p>
+            <w:r>
+              <w:rPr>
+                <w:sz w:val="20"/>
+              </w:rPr>
+              <w:t xml:space="preserve">Seguridad</w:t>
+            </w:r>
+          </w:p>
+        </w:tc>
+        <w:tc>
+          <w:tcPr>
+            <w:tcW w:w="3135" w:type="dxa"/>
+          </w:tcPr>
+          <w:p>
+            <w:r>
+              <w:rPr>
+                <w:sz w:val="20"/>
+              </w:rPr>
+              <w:t xml:space="preserve">Los permisos por rol y la separación por compañía deben validarse en la API, no solo en la interfaz, y centralizarse en `auth.js` y `alcance.js`.</w:t>
+            </w:r>
+          </w:p>
+        </w:tc>
+      </w:tr>
+      <w:tr>
+        <w:trPr>
+          <w:jc w:val="center"/>
+        </w:trPr>
+        <w:tc>
+          <w:tcPr>
+            <w:tcW w:w="3135" w:type="dxa"/>
+          </w:tcPr>
+          <w:p>
+            <w:r>
+              <w:rPr>
+                <w:sz w:val="20"/>
+              </w:rPr>
+              <w:t xml:space="preserve">RNF-13</w:t>
+            </w:r>
+          </w:p>
+        </w:tc>
+        <w:tc>
+          <w:tcPr>
+            <w:tcW w:w="3135" w:type="dxa"/>
+          </w:tcPr>
+          <w:p>
+            <w:r>
+              <w:rPr>
+                <w:sz w:val="20"/>
+              </w:rPr>
+              <w:t xml:space="preserve">Integridad</w:t>
+            </w:r>
+          </w:p>
+        </w:tc>
+        <w:tc>
+          <w:tcPr>
+            <w:tcW w:w="3135" w:type="dxa"/>
+          </w:tcPr>
+          <w:p>
+            <w:r>
+              <w:rPr>
+                <w:sz w:val="20"/>
+              </w:rPr>
+              <w:t xml:space="preserve">Las operaciones que modifican más de una tabla (reportar una falla, derivarla, registrar o finalizar una mantención) deben ejecutarse en una transacción.</w:t>
             </w:r>
           </w:p>
         </w:tc>
@@ -5335,7 +6707,7 @@
     </w:p>
     <w:p>
       <w:r>
-        <w:t>Base de datos PostgreSQL con siete tablas (ver `backend/schema.sql`):</w:t>
+        <w:t xml:space="preserve">Base de datos PostgreSQL (Supabase) con ocho tablas (ver `Backend/supabase/migrations/`). Todas tienen Row Level Security activado y sin políticas: solo la API accede a los datos.</w:t>
       </w:r>
     </w:p>
     <w:tbl>
@@ -5504,7 +6876,7 @@
               <w:rPr>
                 <w:sz w:val="20"/>
               </w:rPr>
-              <w:t>`usuario`</w:t>
+              <w:t xml:space="preserve">`usuario`</w:t>
             </w:r>
           </w:p>
         </w:tc>
@@ -5517,7 +6889,7 @@
               <w:rPr>
                 <w:sz w:val="20"/>
               </w:rPr>
-              <w:t>`id_usuario` (PK), `rut`, `nombre_completo`, `email`, `password`, `id_rol` (FK), `id_compania` (FK)</w:t>
+              <w:t xml:space="preserve">`id_usuario` (PK), `rut`, `nombre_completo`, `email`, `password`, `id_rol` (FK), `id_compania` (FK)</w:t>
             </w:r>
           </w:p>
         </w:tc>
@@ -5530,7 +6902,7 @@
               <w:rPr>
                 <w:sz w:val="20"/>
               </w:rPr>
-              <w:t>`rut` y `email` únicos; FKs `ON DELETE RESTRICT`</w:t>
+              <w:t xml:space="preserve">`rut` y `email` únicos; `password` debe ser un hash bcrypt (CHECK); FKs `ON DELETE RESTRICT`</w:t>
             </w:r>
           </w:p>
         </w:tc>
@@ -5636,7 +7008,7 @@
               <w:rPr>
                 <w:sz w:val="20"/>
               </w:rPr>
-              <w:t>`mantencion`</w:t>
+              <w:t xml:space="preserve">`mantencion`</w:t>
             </w:r>
           </w:p>
         </w:tc>
@@ -5649,7 +7021,7 @@
               <w:rPr>
                 <w:sz w:val="20"/>
               </w:rPr>
-              <w:t>`id_mantencion` (PK), `fecha_ingreso`, `fecha_salida`, `kilometraje_ingreso`, `detalle_trabajo`, `proveedor`, `costo_total`, `mano_obra`, `estado_mantencion`, `id_vehiculo` (FK), `id_tipo_mantencion` (FK), `id_usuario` (FK)</w:t>
+              <w:t xml:space="preserve">`id_mantencion` (PK), `fecha_ingreso`, `fecha_salida`, `kilometraje_ingreso`, `detalle_trabajo`, `proveedor`, `costo_total`, `mano_obra`, `estado_mantencion`, `id_vehiculo` (FK), `id_tipo_mantencion` (FK), `id_usuario` (FK)</w:t>
             </w:r>
           </w:p>
         </w:tc>
@@ -5662,7 +7034,7 @@
               <w:rPr>
                 <w:sz w:val="20"/>
               </w:rPr>
-              <w:t>FKs `ON DELETE RESTRICT`; default `en_proceso`</w:t>
+              <w:t xml:space="preserve">FKs `ON DELETE RESTRICT`; `estado_mantencion` en (`en_proceso`, `finalizada`) según exista `fecha_salida`, default `en_proceso`; `fecha_salida` ≥ `fecha_ingreso`; costos no negativos y `mano_obra` ≤ `costo_total`</w:t>
             </w:r>
           </w:p>
         </w:tc>
@@ -5707,6 +7079,50 @@
                 <w:sz w:val="20"/>
               </w:rPr>
               <w:t>FK `ON DELETE CASCADE`; default `pendiente`</w:t>
+            </w:r>
+          </w:p>
+        </w:tc>
+      </w:tr>
+      <w:tr>
+        <w:trPr>
+          <w:jc w:val="center"/>
+        </w:trPr>
+        <w:tc>
+          <w:tcPr>
+            <w:tcW w:w="3135" w:type="dxa"/>
+          </w:tcPr>
+          <w:p>
+            <w:r>
+              <w:rPr>
+                <w:sz w:val="20"/>
+              </w:rPr>
+              <w:t xml:space="preserve">`reporte_falla`</w:t>
+            </w:r>
+          </w:p>
+        </w:tc>
+        <w:tc>
+          <w:tcPr>
+            <w:tcW w:w="3135" w:type="dxa"/>
+          </w:tcPr>
+          <w:p>
+            <w:r>
+              <w:rPr>
+                <w:sz w:val="20"/>
+              </w:rPr>
+              <w:t xml:space="preserve">`id_reporte_falla` (PK), `fecha_reporte`, `urgencia`, `descripcion`, `estado_reporte`, `fecha_derivacion`, `id_vehiculo` (FK), `id_usuario` (FK), `id_usuario_deriva` (FK), `id_mantencion` (FK)</w:t>
+            </w:r>
+          </w:p>
+        </w:tc>
+        <w:tc>
+          <w:tcPr>
+            <w:tcW w:w="3135" w:type="dxa"/>
+          </w:tcPr>
+          <w:p>
+            <w:r>
+              <w:rPr>
+                <w:sz w:val="20"/>
+              </w:rPr>
+              <w:t xml:space="preserve">`urgencia` en (`alta`, `media`, `baja`); `estado_reporte` en (`pendiente`, `derivado`, `resuelto`), default `pendiente`; descripción no vacía; si está derivado exige fecha y usuario de derivación; FKs `ON DELETE RESTRICT`</w:t>
             </w:r>
           </w:p>
         </w:tc>
@@ -5807,7 +7223,7 @@
               <w:rPr>
                 <w:sz w:val="20"/>
               </w:rPr>
-              <w:t>RF-01 a RF-04</w:t>
+              <w:t xml:space="preserve">RF-01 a RF-04</w:t>
             </w:r>
           </w:p>
         </w:tc>
@@ -5820,7 +7236,7 @@
               <w:rPr>
                 <w:sz w:val="20"/>
               </w:rPr>
-              <w:t>API `auth.js`, página `Login.jsx`, `store.jsx` (sesión persistente)</w:t>
+              <w:t xml:space="preserve">API `auth.js` (middleware y rutas `/api/auth`), página `Login.jsx`, `store.jsx` (recupera la sesión con `/api/auth/me`)</w:t>
             </w:r>
           </w:p>
         </w:tc>
@@ -6038,6 +7454,99 @@
                 <w:sz w:val="20"/>
               </w:rPr>
               <w:t>APIs `companias.js`, `roles.js`, `tiposMantencion.js`</w:t>
+            </w:r>
+          </w:p>
+        </w:tc>
+      </w:tr>
+      <w:tr>
+        <w:trPr>
+          <w:jc w:val="center"/>
+        </w:trPr>
+        <w:tc>
+          <w:tcPr>
+            <w:tcW w:w="4703" w:type="dxa"/>
+          </w:tcPr>
+          <w:p>
+            <w:r>
+              <w:rPr>
+                <w:sz w:val="20"/>
+              </w:rPr>
+              <w:t xml:space="preserve">RF-37 a RF-41</w:t>
+            </w:r>
+          </w:p>
+        </w:tc>
+        <w:tc>
+          <w:tcPr>
+            <w:tcW w:w="4703" w:type="dxa"/>
+          </w:tcPr>
+          <w:p>
+            <w:r>
+              <w:rPr>
+                <w:sz w:val="20"/>
+              </w:rPr>
+              <w:t xml:space="preserve">API `fallas.js`, `estadoVehiculo.js`, `ReportFault.jsx`, `Faults.jsx`, `VehicleDetail.jsx`</w:t>
+            </w:r>
+          </w:p>
+        </w:tc>
+      </w:tr>
+      <w:tr>
+        <w:trPr>
+          <w:jc w:val="center"/>
+        </w:trPr>
+        <w:tc>
+          <w:tcPr>
+            <w:tcW w:w="4703" w:type="dxa"/>
+          </w:tcPr>
+          <w:p>
+            <w:r>
+              <w:rPr>
+                <w:sz w:val="20"/>
+              </w:rPr>
+              <w:t xml:space="preserve">RF-42 a RF-46</w:t>
+            </w:r>
+          </w:p>
+        </w:tc>
+        <w:tc>
+          <w:tcPr>
+            <w:tcW w:w="4703" w:type="dxa"/>
+          </w:tcPr>
+          <w:p>
+            <w:r>
+              <w:rPr>
+                <w:sz w:val="20"/>
+              </w:rPr>
+              <w:t xml:space="preserve">`preventiva.js`, `estadoVehiculo.js`, API `mantenimientos.js`, `RegisterMaintenance.jsx`, `Alerts.jsx`</w:t>
+            </w:r>
+          </w:p>
+        </w:tc>
+      </w:tr>
+      <w:tr>
+        <w:trPr>
+          <w:jc w:val="center"/>
+        </w:trPr>
+        <w:tc>
+          <w:tcPr>
+            <w:tcW w:w="4703" w:type="dxa"/>
+          </w:tcPr>
+          <w:p>
+            <w:r>
+              <w:rPr>
+                <w:sz w:val="20"/>
+              </w:rPr>
+              <w:t xml:space="preserve">RF-47 a RF-49</w:t>
+            </w:r>
+          </w:p>
+        </w:tc>
+        <w:tc>
+          <w:tcPr>
+            <w:tcW w:w="4703" w:type="dxa"/>
+          </w:tcPr>
+          <w:p>
+            <w:r>
+              <w:rPr>
+                <w:sz w:val="20"/>
+              </w:rPr>
+              <w:t xml:space="preserve">`alcance.js`, selector de compañía en `TopNav.jsx`, `Dashboard.jsx`</w:t>
             </w:r>
           </w:p>
         </w:tc>
@@ -6088,7 +7597,22 @@
     </w:p>
     <w:p>
       <w:r>
-        <w:t>6. El stack completo se levanta con `docker compose` de forma reproducible.</w:t>
+        <w:t xml:space="preserve">6. El stack completo se levanta de forma reproducible (Supabase CLI para la base de datos y `docker compose` o `npm` para la API y el frontend).</w:t>
+      </w:r>
+    </w:p>
+    <w:p>
+      <w:r>
+        <w:t xml:space="preserve">7. El flujo de fallas (reporte → derivación → mantención) actualiza el estado del vehículo según RF-44.</w:t>
+      </w:r>
+    </w:p>
+    <w:p>
+      <w:r>
+        <w:t xml:space="preserve">8. Cada usuario ve solo los datos de su compañía y el administrador puede revisarlas todas.</w:t>
+      </w:r>
+    </w:p>
+    <w:p>
+      <w:r>
+        <w:t xml:space="preserve">9. Los casos del Plan de Pruebas de cada sprint se ejecutan y quedan registrados con su evidencia en `Evidencias/Pruebas/`.</w:t>
       </w:r>
     </w:p>
     <w:sectPr>

</xml_diff>